<commit_message>
feat: show client company + SAP ID on offer list rows
Adds a line under offer_id (above the offer's own name) on the "Moje
oferty" list showing "Company — SAP: <id>", with a placeholder when
the client company hasn't been filled in yet. Covers all 4 UI
languages. Updates the v1.9 changelog report accordingly.

Co-Authored-By: Claude Sonnet 5 <noreply@anthropic.com>
</commit_message>
<xml_diff>
--- a/Historia wersji oraz md/Historia wersji/AMSteel_Quote_Raport_Wersji_1.9.docx
+++ b/Historia wersji oraz md/Historia wersji/AMSteel_Quote_Raport_Wersji_1.9.docx
@@ -280,7 +280,11 @@
           <w:tcPr>
             <w:tcW w:w="3678" w:type="dxa"/>
           </w:tcPr>
-          <w:p/>
+          <w:p>
+            <w:r>
+              <w:t>Naprawiono podatność XSS w komunikatach ostrzegawczych kalkulatora o grubości/szerokości poza zakresem tabeli - wartości wstawiane do tych komunikatów (wcześniej bez oczyszczenia, przez dangerouslySetInnerHTML) są teraz oczyszczane (funkcja formatWarning w lib/translations.ts). Na liście „Moje oferty” dodano linię z firmą klienta i numerem SAP bezpośrednio pod numerem oferty, nad nazwą własną oferty, z placeholderem dla ofert bez jeszcze uzupełnionych danych klienta; zmiana obejmuje wszystkie 4 języki interfejsu.</w:t>
+            </w:r>
+          </w:p>
         </w:tc>
       </w:tr>
       <w:tr>
@@ -987,7 +991,7 @@
           </w:tcPr>
           <w:p>
             <w:r>
-              <w:t>–</w:t>
+              <w:t>Zmiana</w:t>
             </w:r>
           </w:p>
         </w:tc>
@@ -997,7 +1001,7 @@
           </w:tcPr>
           <w:p>
             <w:r>
-              <w:t>Brak zmian</w:t>
+              <w:t>Kolejność informacji w nagłówku wiersza na liście „Moje oferty” rozszerzona o dane klienta: bezpośrednio pod numerem oferty (offer_id) pojawia się teraz osobna linia z nazwą firmy i numerem SAP klienta („Firma — SAP: 12345”, a przy braku SAP ID sama nazwa firmy), a nazwa własna oferty (jeśli różni się od offer_id) zeszła o jedną linię niżej, pod nią. Dla ofert bez jeszcze uzupełnionych danych klienta (świeże szkice) linia pokazuje placeholder „— brak danych firmy —”, tak by wysokość wiersza nie zmieniała się po ich uzupełnieniu. Zmiana obejmuje wszystkie 4 języki interfejsu aplikacji (PL/EN/CS/DE).</w:t>
             </w:r>
           </w:p>
         </w:tc>

</xml_diff>

<commit_message>
feat: search + sort offers by company and SAP ID everywhere
Offer search (Moje oferty, panel Starszego handlowca, panel Administratora)
now also matches client company name and SAP ID, read from the offer's own
saved clientInfo snapshot so results always visibly match the typed phrase.

Sort dropdown on Moje oferty: "Nazwa" renamed to "Nazwa oferty" so it isn't
confused with client company name, plus new "Firma" and "SAP ID" sort
options. Senior and Admin offer panels, which had no sort control at all,
gained the same full set (date/name/company/SAP ID/value/status) - Senior's
existing pending-review-first default ordering is preserved regardless of
sort direction.

Updated the v1.9 version report accordingly.

Co-Authored-By: Claude Sonnet 5 <noreply@anthropic.com>
</commit_message>
<xml_diff>
--- a/Historia wersji oraz md/Historia wersji/AMSteel_Quote_Raport_Wersji_1.9.docx
+++ b/Historia wersji oraz md/Historia wersji/AMSteel_Quote_Raport_Wersji_1.9.docx
@@ -282,7 +282,7 @@
           </w:tcPr>
           <w:p>
             <w:r>
-              <w:t>Naprawiono podatność XSS w komunikatach ostrzegawczych kalkulatora o grubości/szerokości poza zakresem tabeli - wartości wstawiane do tych komunikatów (wcześniej bez oczyszczenia, przez dangerouslySetInnerHTML) są teraz oczyszczane (funkcja formatWarning w lib/translations.ts). Na liście „Moje oferty” dodano linię z firmą klienta i numerem SAP bezpośrednio pod numerem oferty, nad nazwą własną oferty, z placeholderem dla ofert bez jeszcze uzupełnionych danych klienta; zmiana obejmuje wszystkie 4 języki interfejsu.</w:t>
+              <w:t>Naprawiono podatność XSS w komunikatach ostrzegawczych kalkulatora o grubości/szerokości poza zakresem tabeli - wartości wstawiane do tych komunikatów (wcześniej bez oczyszczenia, przez dangerouslySetInnerHTML) są teraz oczyszczane (funkcja formatWarning w lib/translations.ts). Na liście „Moje oferty” dodano linię z firmą klienta i numerem SAP bezpośrednio pod numerem oferty, nad nazwą własną oferty, z placeholderem dla ofert bez jeszcze uzupełnionych danych klienta; zmiana obejmuje wszystkie 4 języki interfejsu. Wyszukiwarka i sortowanie na liście ofert rozszerzone o firmę klienta i numer SAP ID (dodatkowo w panelach Starszego handlowca i Administratora pojawiło się sortowanie, którego wcześniej tam w ogóle nie było).</w:t>
             </w:r>
           </w:p>
         </w:tc>
@@ -1006,6 +1006,28 @@
           </w:p>
         </w:tc>
       </w:tr>
+      <w:tr>
+        <w:tc>
+          <w:tcPr>
+            <w:tcW w:w="1948" w:type="dxa"/>
+          </w:tcPr>
+          <w:p>
+            <w:r>
+              <w:t>Nowa funkcja</w:t>
+            </w:r>
+          </w:p>
+        </w:tc>
+        <w:tc>
+          <w:tcPr>
+            <w:tcW w:w="6908" w:type="dxa"/>
+          </w:tcPr>
+          <w:p>
+            <w:r>
+              <w:t>Wyszukiwarka na liście „Moje oferty” (oraz w panelach Starszego handlowca i Administratora) rozszerzona o dopasowanie po nazwie firmy klienta i numerze SAP ID, nie tylko po nazwie/numerze oferty jak dotychczas - dane porównywane są z zapisanym w samej ofercie offer_data.clientInfo, więc wynik zawsze widocznie zawiera wpisaną frazę. Opcja sortowania „Nazwa” na liście „Moje oferty” zmieniona na „Nazwa oferty”, żeby nie myliła się z nazwą firmy klienta, a obok niej doszły nowe opcje sortowania „Firma” i „SAP ID”. Panele Starszego handlowca i Administratora, które wcześniej nie miały żadnego sortowania, dostały ten sam pełny zestaw (data, nazwa oferty, firma, SAP ID, wartość, status) - dla Starszego handlowca domyślna kolejność z kolejką ofert do recenzji zawsze na górze została zachowana niezależnie od wybranego kierunku sortowania. Zmiana obejmuje wszystkie 4 języki interfejsu aplikacji (PL/EN/CS/DE).</w:t>
+            </w:r>
+          </w:p>
+        </w:tc>
+      </w:tr>
     </w:tbl>
     <w:p>
       <w:pPr>

</xml_diff>

<commit_message>
fix: fold offer status reason into badge instead of full-width box
The rejection reason and "why the client said no" note were shown as a
separate full-width red block under the client company name on the
"Moje oferty" list, pulling attention away from it. Both are now shown
as truncated text inside the existing compact status badge next to
offer_id (full text via hover tooltip). Updates the v1.9 report.

Co-Authored-By: Claude Sonnet 5 <noreply@anthropic.com>
</commit_message>
<xml_diff>
--- a/Historia wersji oraz md/Historia wersji/AMSteel_Quote_Raport_Wersji_1.9.docx
+++ b/Historia wersji oraz md/Historia wersji/AMSteel_Quote_Raport_Wersji_1.9.docx
@@ -282,7 +282,7 @@
           </w:tcPr>
           <w:p>
             <w:r>
-              <w:t>Naprawiono podatność XSS w komunikatach ostrzegawczych kalkulatora o grubości/szerokości poza zakresem tabeli - wartości wstawiane do tych komunikatów (wcześniej bez oczyszczenia, przez dangerouslySetInnerHTML) są teraz oczyszczane (funkcja formatWarning w lib/translations.ts). Na liście „Moje oferty” dodano linię z firmą klienta i numerem SAP bezpośrednio pod numerem oferty, nad nazwą własną oferty, z placeholderem dla ofert bez jeszcze uzupełnionych danych klienta; zmiana obejmuje wszystkie 4 języki interfejsu. Wyszukiwarka i sortowanie na liście ofert rozszerzone o firmę klienta i numer SAP ID (dodatkowo w panelach Starszego handlowca i Administratora pojawiło się sortowanie, którego wcześniej tam w ogóle nie było).</w:t>
+              <w:t>Naprawiono podatność XSS w komunikatach ostrzegawczych kalkulatora o grubości/szerokości poza zakresem tabeli - wartości wstawiane do tych komunikatów (wcześniej bez oczyszczenia, przez dangerouslySetInnerHTML) są teraz oczyszczane (funkcja formatWarning w lib/translations.ts). Na liście „Moje oferty” dodano linię z firmą klienta i numerem SAP bezpośrednio pod numerem oferty, nad nazwą własną oferty, z placeholderem dla ofert bez jeszcze uzupełnionych danych klienta; zmiana obejmuje wszystkie 4 języki interfejsu. Wyszukiwarka i sortowanie na liście ofert rozszerzone o firmę klienta i numer SAP ID (dodatkowo w panelach Starszego handlowca i Administratora pojawiło się sortowanie, którego wcześniej tam w ogóle nie było). Plakietka statusu na liście „Moje oferty” skrócona - powód odrzucenia/przegranej pokazuje się teraz zwięźle obok numeru oferty zamiast w osobnym dużym czerwonym bloku pod nazwą firmy.</w:t>
             </w:r>
           </w:p>
         </w:tc>
@@ -1028,6 +1028,28 @@
           </w:p>
         </w:tc>
       </w:tr>
+      <w:tr>
+        <w:tc>
+          <w:tcPr>
+            <w:tcW w:w="1948" w:type="dxa"/>
+          </w:tcPr>
+          <w:p>
+            <w:r>
+              <w:t>Zmiana</w:t>
+            </w:r>
+          </w:p>
+        </w:tc>
+        <w:tc>
+          <w:tcPr>
+            <w:tcW w:w="6908" w:type="dxa"/>
+          </w:tcPr>
+          <w:p>
+            <w:r>
+              <w:t>Status oferty na liście „Moje oferty” (np. „Przegrana: cena” albo „Odrzucona: &lt;powód&gt;”) pokazywany teraz jako skrócony tekst wewnątrz istniejącej plakietki statusu obok numeru oferty (offer_id), zamiast osobnego pełnowymiarowego czerwonego bloku pod nazwą firmy klienta - ten blok odciągał wzrok handlowca od najważniejszej informacji w wierszu, czyli nazwy firmy. Dłuższy powód jest skracany w plakietce (do ok. 24 znaków), a pełna treść dostępna po najechaniu kursorem (tooltip). Dotyczy zarówno powodu odrzucenia oferty, jak i notatki „dlaczego przegrana” wpisanej przy decyzji klienta.</w:t>
+            </w:r>
+          </w:p>
+        </w:tc>
+      </w:tr>
     </w:tbl>
     <w:p>
       <w:pPr>

</xml_diff>

<commit_message>
feat: visible transport cost badge + fix transport rate dilution bug
Add a "Koszt transportu" badge next to the positions/tons count in the
Zestawienie header, styled with the same accent as the grand total so
it's actually visible against the background.

While wiring it up, found that already-added items' frozen transport
rate was silently diluted by whatever quantity sat in the "Ilosc"
field for a not-yet-added draft item (that field never resets after
Add), because offerTons summed committed items' tons plus the draft's
tons unconditionally. Split it into previewOfferTons (drives the live
price preview for the item being configured, includes the draft) and
committedOfferTons (drives the resync of already-added items, excludes
the draft) so composing a new item no longer reprices items already on
the list.

Also updates the v1.9 changelog docx with both entries.

Co-Authored-By: Claude Sonnet 5 <noreply@anthropic.com>
</commit_message>
<xml_diff>
--- a/Historia wersji oraz md/Historia wersji/AMSteel_Quote_Raport_Wersji_1.9.docx
+++ b/Historia wersji oraz md/Historia wersji/AMSteel_Quote_Raport_Wersji_1.9.docx
@@ -282,7 +282,7 @@
           </w:tcPr>
           <w:p>
             <w:r>
-              <w:t>Naprawiono podatność XSS w komunikatach ostrzegawczych kalkulatora o grubości/szerokości poza zakresem tabeli - wartości wstawiane do tych komunikatów (wcześniej bez oczyszczenia, przez dangerouslySetInnerHTML) są teraz oczyszczane (funkcja formatWarning w lib/translations.ts). Na liście „Moje oferty” dodano linię z firmą klienta i numerem SAP bezpośrednio pod numerem oferty, nad nazwą własną oferty, z placeholderem dla ofert bez jeszcze uzupełnionych danych klienta; zmiana obejmuje wszystkie 4 języki interfejsu. Wyszukiwarka i sortowanie na liście ofert rozszerzone o firmę klienta i numer SAP ID (dodatkowo w panelach Starszego handlowca i Administratora pojawiło się sortowanie, którego wcześniej tam w ogóle nie było). Plakietka statusu na liście „Moje oferty” skrócona - powód odrzucenia/przegranej pokazuje się teraz zwięźle obok numeru oferty zamiast w osobnym dużym czerwonym bloku pod nazwą firmy.</w:t>
+              <w:t>Naprawiono podatność XSS w komunikatach ostrzegawczych kalkulatora o grubości/szerokości poza zakresem tabeli - wartości wstawiane do tych komunikatów (wcześniej bez oczyszczenia, przez dangerouslySetInnerHTML) są teraz oczyszczane (funkcja formatWarning w lib/translations.ts). Na liście „Moje oferty” dodano linię z firmą klienta i numerem SAP bezpośrednio pod numerem oferty, nad nazwą własną oferty, z placeholderem dla ofert bez jeszcze uzupełnionych danych klienta; zmiana obejmuje wszystkie 4 języki interfejsu. Wyszukiwarka i sortowanie na liście ofert rozszerzone o firmę klienta i numer SAP ID (dodatkowo w panelach Starszego handlowca i Administratora pojawiło się sortowanie, którego wcześniej tam w ogóle nie było). Plakietka statusu na liście „Moje oferty” skrócona - powód odrzucenia/przegranej pokazuje się teraz zwięźle obok numeru oferty zamiast w osobnym dużym czerwonym bloku pod nazwą firmy. W Zestawieniu dodano widoczną plakietkę z kosztem transportu pozycji z listy i naprawiono zaniżanie stawki transportu €/t na już dodanych pozycjach, powodowane przez niedodany jeszcze szkic kolejnej pozycji w formularzu kalkulatora.</w:t>
             </w:r>
           </w:p>
         </w:tc>
@@ -900,7 +900,7 @@
           </w:tcPr>
           <w:p>
             <w:r>
-              <w:t>–</w:t>
+              <w:t>Nowa funkcja</w:t>
             </w:r>
           </w:p>
         </w:tc>
@@ -910,7 +910,29 @@
           </w:tcPr>
           <w:p>
             <w:r>
-              <w:t>Brak zmian</w:t>
+              <w:t>W nagłówku Zestawienia obok liczby pozycji i tonażu dodano widoczną plakietkę „Koszt transportu” z sumą kosztu transportu wyliczoną tylko dla pozycji faktycznie znajdujących się w zestawieniu (każda pozycja liczona po swojej zamrożonej stawce €/t × jej tonaż) - wcześniej tę informację było widać dopiero po przewinięciu do wiersza RAZEM w stopce tabeli, a plakietka pozycji/tonażu miała kolor zlewający się z tłem. Nowa plakietka używa tego samego akcentu co suma końcowa oferty, więc od razu rzuca się w oczy. Zmiana obejmuje wszystkie 4 języki interfejsu (PL/EN/CS/DE).</w:t>
+            </w:r>
+          </w:p>
+        </w:tc>
+      </w:tr>
+      <w:tr>
+        <w:tc>
+          <w:tcPr>
+            <w:tcW w:w="1948" w:type="dxa"/>
+          </w:tcPr>
+          <w:p>
+            <w:r>
+              <w:t>Poprawka</w:t>
+            </w:r>
+          </w:p>
+        </w:tc>
+        <w:tc>
+          <w:tcPr>
+            <w:tcW w:w="6908" w:type="dxa"/>
+          </w:tcPr>
+          <w:p>
+            <w:r>
+              <w:t>Naprawiono zaniżanie stawki transportu €/t na pozycjach już dodanych do zestawienia: tonaż użyty do podziału ryczałtu za ciężarówkę obejmował także ilość wpisaną w formularzu KOLEJNEJ, jeszcze niedodanej pozycji (pole „Ilość” zostaje wypełnione domyślną/poprzednią wartością nawet bez kliknięcia „Dodaj do zestawienia”), więc np. przy 1 pozycji w zestawieniu i domyślnym szkicu 1 t system dzielił stawkę tak, jakby w ofercie były 2 t - dla trasy do 100 km dawało to ok. 157 €/t zamiast poprawnych ok. 320 €/t. Wyliczenie stawki transportu rozdzielono na dwie wartości: podgląd (uwzględnia szkic niedodanej pozycji - do wyceny pozycji aktualnie konfigurowanej) i tonaż faktycznie zatwierdzony (tylko pozycje już w zestawieniu - do przeliczania stawki pozycji już dodanych). Samo wpisywanie ilości w formularzu nowej pozycji nie zmienia już po cichu ceny pozycji, które są już na liście.</w:t>
             </w:r>
           </w:p>
         </w:tc>

</xml_diff>

<commit_message>
fix: make senior panel responsive on mobile portrait (chunk 6)
Filter tabs row lacked flex-wrap and overflowed the viewport at 375px,
pushing the "Klienci" tab fully off-screen. The offer action-buttons
row reproduced chunk 4's bug exactly: the outer row lacked flex-wrap,
collapsing the offer-info column to 0px width, and clipping the last
action button past the card's overflow-hidden edge.

Analytics page needed no changes - KpiTiles/WinLossPanel grids and the
data table were already responsive from earlier work.

Also updates the v1.9 version report with this chunk's changes.

Co-Authored-By: Claude Sonnet 5 <noreply@anthropic.com>
</commit_message>
<xml_diff>
--- a/Historia wersji oraz md/Historia wersji/AMSteel_Quote_Raport_Wersji_1.9.docx
+++ b/Historia wersji oraz md/Historia wersji/AMSteel_Quote_Raport_Wersji_1.9.docx
@@ -282,7 +282,7 @@
           </w:tcPr>
           <w:p>
             <w:r>
-              <w:t>Naprawiono podatność XSS w komunikatach ostrzegawczych kalkulatora o grubości/szerokości poza zakresem tabeli - wartości wstawiane do tych komunikatów (wcześniej bez oczyszczenia, przez dangerouslySetInnerHTML) są teraz oczyszczane (funkcja formatWarning w lib/translations.ts). Na liście „Moje oferty” dodano linię z firmą klienta i numerem SAP bezpośrednio pod numerem oferty, nad nazwą własną oferty, z placeholderem dla ofert bez jeszcze uzupełnionych danych klienta; zmiana obejmuje wszystkie 4 języki interfejsu. Wyszukiwarka i sortowanie na liście ofert rozszerzone o firmę klienta i numer SAP ID (dodatkowo w panelach Starszego handlowca i Administratora pojawiło się sortowanie, którego wcześniej tam w ogóle nie było). Plakietka statusu na liście „Moje oferty” skrócona - powód odrzucenia/przegranej pokazuje się teraz zwięźle obok numeru oferty zamiast w osobnym dużym czerwonym bloku pod nazwą firmy. W Zestawieniu dodano widoczną plakietkę z kosztem transportu pozycji z listy i naprawiono zaniżanie stawki transportu €/t na już dodanych pozycjach, powodowane przez niedodany jeszcze szkic kolejnej pozycji w formularzu kalkulatora.</w:t>
+              <w:t>Naprawiono podatność XSS w komunikatach ostrzegawczych kalkulatora o grubości/szerokości poza zakresem tabeli - wartości wstawiane do tych komunikatów (wcześniej bez oczyszczenia, przez dangerouslySetInnerHTML) są teraz oczyszczane (funkcja formatWarning w lib/translations.ts). Na liście „Moje oferty” dodano linię z firmą klienta i numerem SAP bezpośrednio pod numerem oferty, nad nazwą własną oferty, z placeholderem dla ofert bez jeszcze uzupełnionych danych klienta; zmiana obejmuje wszystkie 4 języki interfejsu. Wyszukiwarka i sortowanie na liście ofert rozszerzone o firmę klienta i numer SAP ID (dodatkowo w panelach Starszego handlowca i Administratora pojawiło się sortowanie, którego wcześniej tam w ogóle nie było). Plakietka statusu na liście „Moje oferty” skrócona - powód odrzucenia/przegranej pokazuje się teraz zwięźle obok numeru oferty zamiast w osobnym dużym czerwonym bloku pod nazwą firmy. W Zestawieniu dodano widoczną plakietkę z kosztem transportu pozycji z listy i naprawiono zaniżanie stawki transportu €/t na już dodanych pozycjach, powodowane przez niedodany jeszcze szkic kolejnej pozycji w formularzu kalkulatora. Poprawiono też responsywność całej aplikacji na wąskich ekranach telefonu w orientacji pionowej (ok. 375 px szerokości) - nagłówki i nawigację, kalkulator, listę „Moje oferty”, panele administratora oraz panel Analiza i Starszego handlowca; widok na komputerze i w poziomej orientacji telefonu pozostaje bez zmian.</w:t>
             </w:r>
           </w:p>
         </w:tc>
@@ -1239,7 +1239,7 @@
           </w:tcPr>
           <w:p>
             <w:r>
-              <w:t>–</w:t>
+              <w:t>Poprawka</w:t>
             </w:r>
           </w:p>
         </w:tc>
@@ -1249,7 +1249,7 @@
           </w:tcPr>
           <w:p>
             <w:r>
-              <w:t>Brak zmian</w:t>
+              <w:t>Poprawiono responsywność całej aplikacji w pionowej orientacji telefonu (ok. 375 px szerokości) - dotychczas stałe wielokolumnowe siatki (np. grid-cols-3/4) i sztywne szerokości w pikselach nie miały progów responsywnych, więc na wąskim ekranie kolumny się zgniatały, tekst się urywał, a niektóre wiersze wychodziły poza szerokość ekranu. Poprawiono kolejno: wspólny nagłówek i górną nawigację (zawijanie na dwa wiersze, ikony bez podpisów poniżej progu telefonu) we wszystkich pięciu miejscach, w których nagłówek był powielony; górny pasek parametrów kalkulatora (grubość/szerokość/długość/gatunek, dane klienta i kontaktu) oraz panel dopłat i podsumowania finansowego (rozbicie na jedną kolumnę zamiast zgniecionych 2-3 kolumn); tabelę Zestawienia (zwężone marginesy kolumn, cień przewijania sygnalizujący dodatkową zawartość w poziomie); listę „Moje oferty” (poprawiono nakładające się i ucinane przyciski akcji Excel/PDF/Usuń oraz dodano rozwijanie pełnej nazwy firmy i numeru SAP stuknięciem, bez trwałej zmiany wysokości wiersza); panele administratora (m.in. zgnieciony do dwóch kolumn na telefonie panel wyników „Wyniki” handlowca w zakładce „Handlowcy”, mimo dostępnej szerokości jednej kolumny); oraz panel Analiza i panel Starszego handlowca (zawijanie pięciu zakładek filtrowania kolejki ofert, które wcześniej ucinały ostatnią zakładkę „Klienci” poza ekranem, oraz te same nakładające się przyciski akcji na liście ofert do weryfikacji co w „Moje oferty”). Zmiana dotyczy wyłącznie wąskiego widoku telefonu - wygląd na komputerze i w poziomej orientacji telefonu pozostaje identyczny jak wcześniej.</w:t>
             </w:r>
           </w:p>
         </w:tc>

</xml_diff>

<commit_message>
feat: payment-term "2" preset button + Handlowcy role filter in Analiza
- PaymentTermPicker: add "2" to the day-count presets (0/2/15/30/45/60/90)
  so the existing 2-day default for a brand-new offer shows as a selected
  preset instead of falling into the "Inny" custom field.
- Analytics "Handlowcy" panel: role filter (Wszystko/junior/senior/admin)
  over the salesperson ranking table, computed client-side from data
  already in the /api/analytics payload (facets.users[].role) - no extra
  request.
- Document both changes in the v1.9 version report.

Co-Authored-By: Claude Sonnet 5 <noreply@anthropic.com>
</commit_message>
<xml_diff>
--- a/Historia wersji oraz md/Historia wersji/AMSteel_Quote_Raport_Wersji_1.9.docx
+++ b/Historia wersji oraz md/Historia wersji/AMSteel_Quote_Raport_Wersji_1.9.docx
@@ -1888,7 +1888,7 @@
               <w:t xml:space="preserve"> Okres ważności oferty dostał te same gotowe przyciski (Q1–Q4/„Ten miesiąc”/„Niestandardowy”) co termin płatności, z domyślnym okresem i 2-dniowym terminem dla nowej oferty bez klienta; przywrócono też do stopki PDF linijkę o 48-godzinnej ważności oferty, teraz liczoną z wybranego terminu płatności zamiast na sztywno. Naprawiono też analogiczne do walutowego ucinanie bardzo dużych wartości tonażu w PDF.</w:t>
             </w:r>
             <w:r>
-              <w:t xml:space="preserve"> Okres ważności oferty: przyciski Q1–Q4 pokazują teraz tylko kwartały wybranego roku, które jeszcze się nie zakończyły – dla roku bieżącego znikają więc już minione kwartały (np. we wrześniu widoczne są tylko Q3 i Q4), tak by handlowiec nie mógł wystawić nowej oferty z okresem ważności całkowicie w przeszłości; nowo odslonięte kwartały po zmianie na kolejny rok pojawiają się z krótką animacją zamiast skokowo. Panel „Analiza” zyskał zamykalne plakietki aktywnego zawężenia (handlowiec/typ stali/status/decyzja klienta/firma) widoczne zarówno w zbiorczym pasku na górze, jak i przy powiązanym panelu oraz eksporcie do Excela. Panel „Handlowcy” administratora dostał zakładki filtrowania po roli z licznikiem kont, a lista ofert administratora pokazuje zamykalną plakietkę handlowca, gdy jest już zawężona do konkretnej osoby.</w:t>
+              <w:t xml:space="preserve"> Okres ważności oferty: przyciski Q1–Q4 pokazują teraz tylko kwartały wybranego roku, które jeszcze się nie zakończyły – dla roku bieżącego znikają więc już minione kwartały (np. we wrześniu widoczne są tylko Q3 i Q4), tak by handlowiec nie mógł wystawić nowej oferty z okresem ważności całkowicie w przeszłości; nowo odslonięte kwartały po zmianie na kolejny rok pojawiają się z krótką animacją zamiast skokowo. Panel „Analiza” zyskał zamykalne plakietki aktywnego zawężenia (handlowiec/typ stali/status/decyzja klienta/firma) widoczne zarówno w zbiorczym pasku na górze, jak i przy powiązanym panelu oraz eksporcie do Excela. Panel „Handlowcy” administratora dostał zakładki filtrowania po roli z licznikiem kont, a lista ofert administratora pokazuje zamykalną plakietkę handlowca, gdy jest już zawężona do konkretnej osoby. Dodano przycisk „2” w wyborze terminu płatności (kalkulator, panel „Klienci”), tak by domyślny 2-dniowy termin nowej oferty pokazywał się jako gotowy wybór zamiast wartości wpisanej w polu „Inny”. Panel „Handlowcy” w Analizie zyskał też przełącznik filtrujący ranking wyników wg roli (Wszystko/młodszy handlowiec/starszy handlowiec/administrator), z przeliczeniem udziałów procentowych i wiersza „Razem” dla zawężonej grupy.</w:t>
             </w:r>
           </w:p>
         </w:tc>
@@ -16464,6 +16464,220 @@
           </w:p>
         </w:tc>
       </w:tr>
+      <w:tr>
+        <w:tc>
+          <w:tcPr>
+            <w:tcW w:w="1948" w:type="dxa"/>
+          </w:tcPr>
+          <w:p>
+            <w:proofErr w:type="spellStart"/>
+            <w:r>
+              <w:t>Zmiana</w:t>
+            </w:r>
+            <w:proofErr w:type="spellEnd"/>
+          </w:p>
+        </w:tc>
+        <w:tc>
+          <w:tcPr>
+            <w:tcW w:w="6908" w:type="dxa"/>
+          </w:tcPr>
+          <w:p>
+            <w:proofErr w:type="spellStart"/>
+            <w:r>
+              <w:t>W wyborze terminu płatności (kalkulator, panel „Klienci” administratora oraz Starszego handlowca) dodano osobny przycisk „2” do istniejącego zestawu gotowych wartości dni (0/15/30/45/60/90/„Inny”). Domyślny 2-dniowy termin płatności nowej oferty bez wybranego klienta (wprowadzony wcześniej razem z okresem ważności „Ten miesiąc”) do tej pory nie miał odpowiadającego mu przycisku, więc przy otwarciu kalkulatora pokazywał się jako wartość wpisana ręcznie w polu „Inny” zamiast jako zaznaczony gotowy wybór.</w:t>
+            </w:r>
+            <w:proofErr w:type="spellEnd"/>
+            <w:proofErr w:type="spellStart"/>
+            <w:proofErr w:type="spellEnd"/>
+            <w:proofErr w:type="spellStart"/>
+            <w:proofErr w:type="spellEnd"/>
+            <w:proofErr w:type="spellStart"/>
+            <w:proofErr w:type="spellEnd"/>
+            <w:proofErr w:type="spellStart"/>
+            <w:proofErr w:type="spellEnd"/>
+            <w:proofErr w:type="spellStart"/>
+            <w:proofErr w:type="spellEnd"/>
+            <w:proofErr w:type="spellStart"/>
+            <w:proofErr w:type="spellEnd"/>
+            <w:proofErr w:type="spellStart"/>
+            <w:proofErr w:type="spellEnd"/>
+            <w:proofErr w:type="spellStart"/>
+            <w:proofErr w:type="spellEnd"/>
+            <w:proofErr w:type="spellStart"/>
+            <w:proofErr w:type="spellEnd"/>
+            <w:proofErr w:type="spellStart"/>
+            <w:proofErr w:type="spellEnd"/>
+            <w:proofErr w:type="spellStart"/>
+            <w:proofErr w:type="spellEnd"/>
+            <w:proofErr w:type="spellStart"/>
+            <w:proofErr w:type="spellEnd"/>
+            <w:proofErr w:type="spellStart"/>
+            <w:proofErr w:type="spellEnd"/>
+            <w:proofErr w:type="spellStart"/>
+            <w:proofErr w:type="spellEnd"/>
+            <w:proofErr w:type="spellStart"/>
+            <w:proofErr w:type="spellEnd"/>
+            <w:proofErr w:type="spellStart"/>
+            <w:proofErr w:type="spellEnd"/>
+            <w:proofErr w:type="spellStart"/>
+            <w:proofErr w:type="spellEnd"/>
+            <w:proofErr w:type="spellStart"/>
+            <w:proofErr w:type="spellEnd"/>
+            <w:proofErr w:type="spellStart"/>
+            <w:proofErr w:type="spellEnd"/>
+            <w:proofErr w:type="spellStart"/>
+            <w:proofErr w:type="spellEnd"/>
+            <w:proofErr w:type="spellStart"/>
+            <w:proofErr w:type="spellEnd"/>
+            <w:proofErr w:type="spellStart"/>
+            <w:proofErr w:type="spellEnd"/>
+            <w:proofErr w:type="spellStart"/>
+            <w:proofErr w:type="spellEnd"/>
+            <w:proofErr w:type="spellStart"/>
+            <w:proofErr w:type="spellEnd"/>
+            <w:proofErr w:type="spellStart"/>
+            <w:proofErr w:type="spellEnd"/>
+            <w:proofErr w:type="spellStart"/>
+            <w:proofErr w:type="spellEnd"/>
+            <w:proofErr w:type="spellStart"/>
+            <w:proofErr w:type="spellEnd"/>
+            <w:proofErr w:type="spellStart"/>
+            <w:proofErr w:type="spellEnd"/>
+            <w:proofErr w:type="spellStart"/>
+            <w:proofErr w:type="spellEnd"/>
+            <w:proofErr w:type="spellStart"/>
+            <w:proofErr w:type="spellEnd"/>
+            <w:proofErr w:type="spellStart"/>
+            <w:proofErr w:type="spellEnd"/>
+            <w:proofErr w:type="spellStart"/>
+            <w:proofErr w:type="spellEnd"/>
+            <w:proofErr w:type="spellStart"/>
+            <w:proofErr w:type="spellEnd"/>
+            <w:proofErr w:type="spellStart"/>
+            <w:proofErr w:type="spellEnd"/>
+            <w:proofErr w:type="spellStart"/>
+            <w:proofErr w:type="spellEnd"/>
+            <w:proofErr w:type="spellStart"/>
+            <w:proofErr w:type="spellEnd"/>
+            <w:proofErr w:type="spellStart"/>
+            <w:proofErr w:type="spellEnd"/>
+            <w:proofErr w:type="spellStart"/>
+            <w:proofErr w:type="spellEnd"/>
+            <w:proofErr w:type="spellStart"/>
+            <w:proofErr w:type="spellEnd"/>
+            <w:proofErr w:type="spellStart"/>
+            <w:proofErr w:type="spellEnd"/>
+            <w:proofErr w:type="spellStart"/>
+            <w:proofErr w:type="spellEnd"/>
+            <w:proofErr w:type="spellStart"/>
+            <w:proofErr w:type="spellEnd"/>
+            <w:proofErr w:type="spellStart"/>
+            <w:proofErr w:type="spellEnd"/>
+            <w:proofErr w:type="spellStart"/>
+            <w:proofErr w:type="spellEnd"/>
+            <w:proofErr w:type="spellStart"/>
+            <w:proofErr w:type="spellEnd"/>
+            <w:proofErr w:type="spellStart"/>
+            <w:proofErr w:type="spellEnd"/>
+            <w:proofErr w:type="spellStart"/>
+            <w:proofErr w:type="spellEnd"/>
+            <w:proofErr w:type="spellStart"/>
+            <w:proofErr w:type="spellEnd"/>
+            <w:proofErr w:type="spellStart"/>
+            <w:proofErr w:type="spellEnd"/>
+            <w:proofErr w:type="spellStart"/>
+            <w:proofErr w:type="spellEnd"/>
+            <w:proofErr w:type="spellStart"/>
+            <w:proofErr w:type="spellEnd"/>
+            <w:proofErr w:type="spellStart"/>
+            <w:proofErr w:type="spellEnd"/>
+            <w:proofErr w:type="spellStart"/>
+            <w:proofErr w:type="spellEnd"/>
+            <w:proofErr w:type="spellStart"/>
+            <w:proofErr w:type="spellEnd"/>
+            <w:proofErr w:type="spellStart"/>
+            <w:proofErr w:type="spellEnd"/>
+            <w:proofErr w:type="spellStart"/>
+            <w:proofErr w:type="spellEnd"/>
+            <w:proofErr w:type="spellStart"/>
+            <w:proofErr w:type="spellEnd"/>
+            <w:proofErr w:type="spellStart"/>
+            <w:proofErr w:type="spellEnd"/>
+            <w:proofErr w:type="spellStart"/>
+            <w:proofErr w:type="spellEnd"/>
+            <w:proofErr w:type="spellStart"/>
+            <w:proofErr w:type="spellEnd"/>
+            <w:proofErr w:type="spellStart"/>
+            <w:proofErr w:type="spellEnd"/>
+            <w:proofErr w:type="spellStart"/>
+            <w:proofErr w:type="spellEnd"/>
+            <w:proofErr w:type="spellStart"/>
+            <w:proofErr w:type="spellEnd"/>
+            <w:proofErr w:type="spellStart"/>
+            <w:proofErr w:type="spellEnd"/>
+            <w:proofErr w:type="spellStart"/>
+            <w:proofErr w:type="spellEnd"/>
+            <w:proofErr w:type="spellStart"/>
+            <w:proofErr w:type="spellEnd"/>
+            <w:proofErr w:type="spellStart"/>
+            <w:proofErr w:type="spellEnd"/>
+            <w:proofErr w:type="spellStart"/>
+            <w:proofErr w:type="spellEnd"/>
+            <w:proofErr w:type="spellStart"/>
+            <w:proofErr w:type="spellEnd"/>
+            <w:proofErr w:type="spellStart"/>
+            <w:proofErr w:type="spellEnd"/>
+            <w:proofErr w:type="spellStart"/>
+            <w:proofErr w:type="spellEnd"/>
+            <w:proofErr w:type="spellStart"/>
+            <w:proofErr w:type="spellEnd"/>
+            <w:proofErr w:type="spellStart"/>
+            <w:proofErr w:type="spellEnd"/>
+            <w:proofErr w:type="spellStart"/>
+            <w:proofErr w:type="spellEnd"/>
+            <w:proofErr w:type="spellStart"/>
+            <w:proofErr w:type="spellEnd"/>
+            <w:proofErr w:type="spellStart"/>
+            <w:proofErr w:type="spellEnd"/>
+            <w:proofErr w:type="spellStart"/>
+            <w:proofErr w:type="spellEnd"/>
+            <w:proofErr w:type="spellStart"/>
+            <w:proofErr w:type="spellEnd"/>
+            <w:proofErr w:type="spellStart"/>
+            <w:proofErr w:type="spellEnd"/>
+            <w:proofErr w:type="spellStart"/>
+            <w:proofErr w:type="spellEnd"/>
+            <w:proofErr w:type="spellStart"/>
+            <w:proofErr w:type="spellEnd"/>
+            <w:proofErr w:type="spellStart"/>
+            <w:proofErr w:type="spellEnd"/>
+            <w:proofErr w:type="spellStart"/>
+            <w:proofErr w:type="spellEnd"/>
+            <w:proofErr w:type="spellStart"/>
+            <w:proofErr w:type="spellEnd"/>
+            <w:proofErr w:type="spellStart"/>
+            <w:proofErr w:type="spellEnd"/>
+            <w:proofErr w:type="spellStart"/>
+            <w:proofErr w:type="spellEnd"/>
+            <w:proofErr w:type="spellStart"/>
+            <w:proofErr w:type="spellEnd"/>
+            <w:proofErr w:type="spellStart"/>
+            <w:proofErr w:type="spellEnd"/>
+            <w:proofErr w:type="spellStart"/>
+            <w:proofErr w:type="spellEnd"/>
+            <w:proofErr w:type="spellStart"/>
+            <w:proofErr w:type="spellEnd"/>
+            <w:proofErr w:type="spellStart"/>
+            <w:proofErr w:type="spellEnd"/>
+            <w:proofErr w:type="spellStart"/>
+            <w:proofErr w:type="spellEnd"/>
+            <w:proofErr w:type="spellStart"/>
+            <w:proofErr w:type="spellEnd"/>
+            <w:proofErr w:type="spellStart"/>
+            <w:proofErr w:type="spellEnd"/>
+          </w:p>
+        </w:tc>
+      </w:tr>
     </w:tbl>
     <w:p>
       <w:pPr>
@@ -21025,6 +21239,390 @@
             <w:proofErr w:type="spellStart"/>
             <w:r>
               <w:t>Panel „Handlowcy” administratora zyskał zakładki filtrowania po roli (Wszyscy/młodszy handlowiec/starszy handlowiec/administrator) z liczbą kont przy każdej zakładce, zamiast pokazywania zawsze pełnej listy. Lista ofert administratora („Oferty”) pokazuje teraz zamykalną plakietkę z nazwiskiem handlowca, gdy lista jest już zawężona do konkretnej osoby (np. po kliknięciu „Zobacz oferty” w panelu Handlowcy) – bez konieczności przewijania do skrzynki filtrów wyżej, żeby wyczyścić to zawężenie.</w:t>
+            </w:r>
+            <w:proofErr w:type="spellEnd"/>
+            <w:proofErr w:type="spellStart"/>
+            <w:proofErr w:type="spellEnd"/>
+            <w:proofErr w:type="spellStart"/>
+            <w:proofErr w:type="spellEnd"/>
+            <w:proofErr w:type="spellStart"/>
+            <w:proofErr w:type="spellEnd"/>
+            <w:proofErr w:type="spellStart"/>
+            <w:proofErr w:type="spellEnd"/>
+            <w:proofErr w:type="spellStart"/>
+            <w:proofErr w:type="spellEnd"/>
+            <w:proofErr w:type="spellStart"/>
+            <w:proofErr w:type="spellEnd"/>
+            <w:proofErr w:type="spellStart"/>
+            <w:proofErr w:type="spellEnd"/>
+            <w:proofErr w:type="spellStart"/>
+            <w:proofErr w:type="spellEnd"/>
+            <w:proofErr w:type="spellStart"/>
+            <w:proofErr w:type="spellEnd"/>
+            <w:proofErr w:type="spellStart"/>
+            <w:proofErr w:type="spellEnd"/>
+            <w:proofErr w:type="spellStart"/>
+            <w:proofErr w:type="spellEnd"/>
+            <w:proofErr w:type="spellStart"/>
+            <w:proofErr w:type="spellEnd"/>
+            <w:proofErr w:type="spellStart"/>
+            <w:proofErr w:type="spellEnd"/>
+            <w:proofErr w:type="spellStart"/>
+            <w:proofErr w:type="spellEnd"/>
+            <w:proofErr w:type="spellStart"/>
+            <w:proofErr w:type="spellEnd"/>
+            <w:proofErr w:type="spellStart"/>
+            <w:proofErr w:type="spellEnd"/>
+            <w:proofErr w:type="spellStart"/>
+            <w:proofErr w:type="spellEnd"/>
+            <w:proofErr w:type="spellStart"/>
+            <w:proofErr w:type="spellEnd"/>
+            <w:proofErr w:type="spellStart"/>
+            <w:proofErr w:type="spellEnd"/>
+            <w:proofErr w:type="spellStart"/>
+            <w:proofErr w:type="spellEnd"/>
+            <w:proofErr w:type="spellStart"/>
+            <w:proofErr w:type="spellEnd"/>
+            <w:proofErr w:type="spellStart"/>
+            <w:proofErr w:type="spellEnd"/>
+            <w:proofErr w:type="spellStart"/>
+            <w:proofErr w:type="spellEnd"/>
+            <w:proofErr w:type="spellStart"/>
+            <w:proofErr w:type="spellEnd"/>
+            <w:proofErr w:type="spellStart"/>
+            <w:proofErr w:type="spellEnd"/>
+            <w:proofErr w:type="spellStart"/>
+            <w:proofErr w:type="spellEnd"/>
+            <w:proofErr w:type="spellStart"/>
+            <w:proofErr w:type="spellEnd"/>
+            <w:proofErr w:type="spellStart"/>
+            <w:proofErr w:type="spellEnd"/>
+            <w:proofErr w:type="spellStart"/>
+            <w:proofErr w:type="spellEnd"/>
+            <w:proofErr w:type="spellStart"/>
+            <w:proofErr w:type="spellEnd"/>
+            <w:proofErr w:type="spellStart"/>
+            <w:proofErr w:type="spellEnd"/>
+            <w:proofErr w:type="spellStart"/>
+            <w:proofErr w:type="spellEnd"/>
+            <w:proofErr w:type="spellStart"/>
+            <w:proofErr w:type="spellEnd"/>
+            <w:proofErr w:type="spellStart"/>
+            <w:proofErr w:type="spellEnd"/>
+            <w:proofErr w:type="spellStart"/>
+            <w:proofErr w:type="spellEnd"/>
+            <w:proofErr w:type="spellStart"/>
+            <w:proofErr w:type="spellEnd"/>
+            <w:proofErr w:type="spellStart"/>
+            <w:proofErr w:type="spellEnd"/>
+            <w:proofErr w:type="spellStart"/>
+            <w:proofErr w:type="spellEnd"/>
+            <w:proofErr w:type="spellStart"/>
+            <w:proofErr w:type="spellEnd"/>
+            <w:proofErr w:type="spellStart"/>
+            <w:proofErr w:type="spellEnd"/>
+            <w:proofErr w:type="spellStart"/>
+            <w:proofErr w:type="spellEnd"/>
+            <w:proofErr w:type="spellStart"/>
+            <w:proofErr w:type="spellEnd"/>
+            <w:proofErr w:type="spellStart"/>
+            <w:proofErr w:type="spellEnd"/>
+            <w:proofErr w:type="spellStart"/>
+            <w:proofErr w:type="spellEnd"/>
+            <w:proofErr w:type="spellStart"/>
+            <w:proofErr w:type="spellEnd"/>
+            <w:proofErr w:type="spellStart"/>
+            <w:proofErr w:type="spellEnd"/>
+            <w:proofErr w:type="spellStart"/>
+            <w:proofErr w:type="spellEnd"/>
+            <w:proofErr w:type="spellStart"/>
+            <w:proofErr w:type="spellEnd"/>
+            <w:proofErr w:type="spellStart"/>
+            <w:proofErr w:type="spellEnd"/>
+            <w:proofErr w:type="spellStart"/>
+            <w:proofErr w:type="spellEnd"/>
+            <w:proofErr w:type="spellStart"/>
+            <w:proofErr w:type="spellEnd"/>
+            <w:proofErr w:type="spellStart"/>
+            <w:proofErr w:type="spellEnd"/>
+            <w:proofErr w:type="spellStart"/>
+            <w:proofErr w:type="spellEnd"/>
+            <w:proofErr w:type="spellStart"/>
+            <w:proofErr w:type="spellEnd"/>
+            <w:proofErr w:type="spellStart"/>
+            <w:proofErr w:type="spellEnd"/>
+            <w:proofErr w:type="spellStart"/>
+            <w:proofErr w:type="spellEnd"/>
+            <w:proofErr w:type="spellStart"/>
+            <w:proofErr w:type="spellEnd"/>
+            <w:proofErr w:type="spellStart"/>
+            <w:proofErr w:type="spellEnd"/>
+            <w:proofErr w:type="spellStart"/>
+            <w:proofErr w:type="spellEnd"/>
+            <w:proofErr w:type="spellStart"/>
+            <w:proofErr w:type="spellEnd"/>
+            <w:proofErr w:type="spellStart"/>
+            <w:proofErr w:type="spellEnd"/>
+            <w:proofErr w:type="spellStart"/>
+            <w:proofErr w:type="spellEnd"/>
+            <w:proofErr w:type="spellStart"/>
+            <w:proofErr w:type="spellEnd"/>
+            <w:proofErr w:type="spellStart"/>
+            <w:proofErr w:type="spellEnd"/>
+            <w:proofErr w:type="spellStart"/>
+            <w:proofErr w:type="spellEnd"/>
+            <w:proofErr w:type="spellStart"/>
+            <w:proofErr w:type="spellEnd"/>
+            <w:proofErr w:type="spellStart"/>
+            <w:proofErr w:type="spellEnd"/>
+            <w:proofErr w:type="spellStart"/>
+            <w:proofErr w:type="spellEnd"/>
+            <w:proofErr w:type="spellStart"/>
+            <w:proofErr w:type="spellEnd"/>
+            <w:proofErr w:type="spellStart"/>
+            <w:proofErr w:type="spellEnd"/>
+            <w:proofErr w:type="spellStart"/>
+            <w:proofErr w:type="spellEnd"/>
+            <w:proofErr w:type="spellStart"/>
+            <w:proofErr w:type="spellEnd"/>
+            <w:proofErr w:type="spellStart"/>
+            <w:proofErr w:type="spellEnd"/>
+            <w:proofErr w:type="spellStart"/>
+            <w:proofErr w:type="spellEnd"/>
+            <w:proofErr w:type="spellStart"/>
+            <w:proofErr w:type="spellEnd"/>
+            <w:proofErr w:type="spellStart"/>
+            <w:proofErr w:type="spellEnd"/>
+            <w:proofErr w:type="spellStart"/>
+            <w:proofErr w:type="spellEnd"/>
+            <w:proofErr w:type="spellStart"/>
+            <w:proofErr w:type="spellEnd"/>
+            <w:proofErr w:type="spellStart"/>
+            <w:proofErr w:type="spellEnd"/>
+            <w:proofErr w:type="spellStart"/>
+            <w:proofErr w:type="spellEnd"/>
+            <w:proofErr w:type="spellStart"/>
+            <w:proofErr w:type="spellEnd"/>
+            <w:proofErr w:type="spellStart"/>
+            <w:proofErr w:type="spellEnd"/>
+            <w:proofErr w:type="spellStart"/>
+            <w:proofErr w:type="spellEnd"/>
+            <w:proofErr w:type="spellStart"/>
+            <w:proofErr w:type="spellEnd"/>
+            <w:proofErr w:type="spellStart"/>
+            <w:proofErr w:type="spellEnd"/>
+            <w:proofErr w:type="spellStart"/>
+            <w:proofErr w:type="spellEnd"/>
+            <w:proofErr w:type="spellStart"/>
+            <w:proofErr w:type="spellEnd"/>
+            <w:proofErr w:type="spellStart"/>
+            <w:proofErr w:type="spellEnd"/>
+            <w:proofErr w:type="spellStart"/>
+            <w:proofErr w:type="spellEnd"/>
+            <w:proofErr w:type="spellStart"/>
+            <w:proofErr w:type="spellEnd"/>
+            <w:proofErr w:type="spellStart"/>
+            <w:proofErr w:type="spellEnd"/>
+            <w:proofErr w:type="spellStart"/>
+            <w:proofErr w:type="spellEnd"/>
+            <w:proofErr w:type="spellStart"/>
+            <w:proofErr w:type="spellEnd"/>
+            <w:proofErr w:type="spellStart"/>
+            <w:proofErr w:type="spellEnd"/>
+            <w:proofErr w:type="spellStart"/>
+            <w:proofErr w:type="spellEnd"/>
+            <w:proofErr w:type="spellStart"/>
+            <w:proofErr w:type="spellEnd"/>
+            <w:proofErr w:type="spellStart"/>
+            <w:proofErr w:type="spellEnd"/>
+            <w:proofErr w:type="spellStart"/>
+            <w:proofErr w:type="spellEnd"/>
+            <w:proofErr w:type="spellStart"/>
+            <w:proofErr w:type="spellEnd"/>
+            <w:proofErr w:type="spellStart"/>
+            <w:proofErr w:type="spellEnd"/>
+            <w:proofErr w:type="spellStart"/>
+            <w:proofErr w:type="spellEnd"/>
+            <w:proofErr w:type="spellStart"/>
+            <w:proofErr w:type="spellEnd"/>
+            <w:proofErr w:type="spellStart"/>
+            <w:proofErr w:type="spellEnd"/>
+            <w:proofErr w:type="spellStart"/>
+            <w:proofErr w:type="spellEnd"/>
+            <w:proofErr w:type="spellStart"/>
+            <w:proofErr w:type="spellEnd"/>
+            <w:proofErr w:type="spellStart"/>
+            <w:proofErr w:type="spellEnd"/>
+            <w:proofErr w:type="spellStart"/>
+            <w:proofErr w:type="spellEnd"/>
+            <w:proofErr w:type="spellStart"/>
+            <w:proofErr w:type="spellEnd"/>
+            <w:proofErr w:type="spellStart"/>
+            <w:proofErr w:type="spellEnd"/>
+            <w:proofErr w:type="spellStart"/>
+            <w:proofErr w:type="spellEnd"/>
+            <w:proofErr w:type="spellStart"/>
+            <w:proofErr w:type="spellEnd"/>
+            <w:proofErr w:type="spellStart"/>
+            <w:proofErr w:type="spellEnd"/>
+            <w:proofErr w:type="spellStart"/>
+            <w:proofErr w:type="spellEnd"/>
+            <w:proofErr w:type="spellStart"/>
+            <w:proofErr w:type="spellEnd"/>
+            <w:proofErr w:type="spellStart"/>
+            <w:proofErr w:type="spellEnd"/>
+            <w:proofErr w:type="spellStart"/>
+            <w:proofErr w:type="spellEnd"/>
+            <w:proofErr w:type="spellStart"/>
+            <w:proofErr w:type="spellEnd"/>
+            <w:proofErr w:type="spellStart"/>
+            <w:proofErr w:type="spellEnd"/>
+            <w:proofErr w:type="spellStart"/>
+            <w:proofErr w:type="spellEnd"/>
+            <w:proofErr w:type="spellStart"/>
+            <w:proofErr w:type="spellEnd"/>
+            <w:proofErr w:type="spellStart"/>
+            <w:proofErr w:type="spellEnd"/>
+            <w:proofErr w:type="spellStart"/>
+            <w:proofErr w:type="spellEnd"/>
+            <w:proofErr w:type="spellStart"/>
+            <w:proofErr w:type="spellEnd"/>
+            <w:proofErr w:type="spellStart"/>
+            <w:proofErr w:type="spellEnd"/>
+            <w:proofErr w:type="spellStart"/>
+            <w:proofErr w:type="spellEnd"/>
+            <w:proofErr w:type="spellStart"/>
+            <w:proofErr w:type="spellEnd"/>
+            <w:proofErr w:type="spellStart"/>
+            <w:proofErr w:type="spellEnd"/>
+            <w:proofErr w:type="spellStart"/>
+            <w:proofErr w:type="spellEnd"/>
+            <w:proofErr w:type="spellStart"/>
+            <w:proofErr w:type="spellEnd"/>
+            <w:proofErr w:type="spellStart"/>
+            <w:proofErr w:type="spellEnd"/>
+            <w:proofErr w:type="spellStart"/>
+            <w:proofErr w:type="spellEnd"/>
+            <w:proofErr w:type="spellStart"/>
+            <w:proofErr w:type="spellEnd"/>
+            <w:proofErr w:type="spellStart"/>
+            <w:proofErr w:type="spellEnd"/>
+            <w:proofErr w:type="spellStart"/>
+            <w:proofErr w:type="spellEnd"/>
+            <w:proofErr w:type="spellStart"/>
+            <w:proofErr w:type="spellEnd"/>
+            <w:proofErr w:type="spellStart"/>
+            <w:proofErr w:type="spellEnd"/>
+            <w:proofErr w:type="spellStart"/>
+            <w:proofErr w:type="spellEnd"/>
+            <w:proofErr w:type="spellStart"/>
+            <w:proofErr w:type="spellEnd"/>
+            <w:proofErr w:type="spellStart"/>
+            <w:proofErr w:type="spellEnd"/>
+            <w:proofErr w:type="spellStart"/>
+            <w:proofErr w:type="spellEnd"/>
+            <w:proofErr w:type="spellStart"/>
+            <w:proofErr w:type="spellEnd"/>
+            <w:proofErr w:type="spellStart"/>
+            <w:proofErr w:type="spellEnd"/>
+            <w:proofErr w:type="spellStart"/>
+            <w:proofErr w:type="spellEnd"/>
+            <w:proofErr w:type="spellStart"/>
+            <w:proofErr w:type="spellEnd"/>
+            <w:proofErr w:type="spellStart"/>
+            <w:proofErr w:type="spellEnd"/>
+            <w:proofErr w:type="spellStart"/>
+            <w:proofErr w:type="spellEnd"/>
+            <w:proofErr w:type="spellStart"/>
+            <w:proofErr w:type="spellEnd"/>
+            <w:proofErr w:type="spellStart"/>
+            <w:proofErr w:type="spellEnd"/>
+            <w:proofErr w:type="spellStart"/>
+            <w:proofErr w:type="spellEnd"/>
+            <w:proofErr w:type="spellStart"/>
+            <w:proofErr w:type="spellEnd"/>
+            <w:proofErr w:type="spellStart"/>
+            <w:proofErr w:type="spellEnd"/>
+            <w:proofErr w:type="spellStart"/>
+            <w:proofErr w:type="spellEnd"/>
+            <w:proofErr w:type="spellStart"/>
+            <w:proofErr w:type="spellEnd"/>
+            <w:proofErr w:type="spellStart"/>
+            <w:proofErr w:type="spellEnd"/>
+            <w:proofErr w:type="spellStart"/>
+            <w:proofErr w:type="spellEnd"/>
+            <w:proofErr w:type="spellStart"/>
+            <w:proofErr w:type="spellEnd"/>
+            <w:proofErr w:type="spellStart"/>
+            <w:proofErr w:type="spellEnd"/>
+            <w:proofErr w:type="spellStart"/>
+            <w:proofErr w:type="spellEnd"/>
+            <w:proofErr w:type="spellStart"/>
+            <w:proofErr w:type="spellEnd"/>
+            <w:proofErr w:type="spellStart"/>
+            <w:proofErr w:type="spellEnd"/>
+            <w:proofErr w:type="spellStart"/>
+            <w:proofErr w:type="spellEnd"/>
+            <w:proofErr w:type="spellStart"/>
+            <w:proofErr w:type="spellEnd"/>
+            <w:proofErr w:type="spellStart"/>
+            <w:proofErr w:type="spellEnd"/>
+            <w:proofErr w:type="spellStart"/>
+            <w:proofErr w:type="spellEnd"/>
+            <w:proofErr w:type="spellStart"/>
+            <w:proofErr w:type="spellEnd"/>
+            <w:proofErr w:type="spellStart"/>
+            <w:proofErr w:type="spellEnd"/>
+            <w:proofErr w:type="spellStart"/>
+            <w:proofErr w:type="spellEnd"/>
+            <w:proofErr w:type="spellStart"/>
+            <w:proofErr w:type="spellEnd"/>
+            <w:proofErr w:type="spellStart"/>
+            <w:proofErr w:type="spellEnd"/>
+            <w:proofErr w:type="spellStart"/>
+            <w:proofErr w:type="spellEnd"/>
+            <w:proofErr w:type="spellStart"/>
+            <w:proofErr w:type="spellEnd"/>
+            <w:proofErr w:type="spellStart"/>
+            <w:proofErr w:type="spellEnd"/>
+            <w:proofErr w:type="spellStart"/>
+            <w:proofErr w:type="spellEnd"/>
+            <w:proofErr w:type="spellStart"/>
+            <w:proofErr w:type="spellEnd"/>
+            <w:proofErr w:type="spellStart"/>
+            <w:proofErr w:type="spellEnd"/>
+            <w:proofErr w:type="spellStart"/>
+            <w:proofErr w:type="spellEnd"/>
+            <w:proofErr w:type="spellStart"/>
+            <w:proofErr w:type="spellEnd"/>
+            <w:proofErr w:type="spellStart"/>
+            <w:proofErr w:type="spellEnd"/>
+            <w:proofErr w:type="spellStart"/>
+            <w:proofErr w:type="spellEnd"/>
+          </w:p>
+        </w:tc>
+      </w:tr>
+      <w:tr>
+        <w:tc>
+          <w:tcPr>
+            <w:tcW w:w="1963" w:type="dxa"/>
+          </w:tcPr>
+          <w:p>
+            <w:proofErr w:type="spellStart"/>
+            <w:r>
+              <w:t>Nowa funkcja</w:t>
+            </w:r>
+            <w:proofErr w:type="spellEnd"/>
+          </w:p>
+        </w:tc>
+        <w:tc>
+          <w:tcPr>
+            <w:tcW w:w="6893" w:type="dxa"/>
+          </w:tcPr>
+          <w:p>
+            <w:proofErr w:type="spellStart"/>
+            <w:r>
+              <w:t>Panel „Handlowcy” w Analizie (ranking wyników per handlowiec, widoczny dla administratora oraz Starszego handlowca z zespołem) zyskał przełącznik filtrujący wg roli (Wszystko/młodszy handlowiec/starszy handlowiec/administrator) nad tabelą rankingu. Zawężenie działa od razu na już pobranych danych, bez dodatkowego zapytania do serwera, i przelicza też udziały procentowe oraz wiersz „Razem” dla zawężonej grupy.</w:t>
             </w:r>
             <w:proofErr w:type="spellEnd"/>
             <w:proofErr w:type="spellStart"/>

</xml_diff>

<commit_message>
feat: warn seller when offer's quarter has a different scheduled PGL price
Calculator now shows a quick info banner when the picked offer-validity
quarter (Q1-Q4) isn't the current one and its scheduled PGL differs from
the currently active price, so the seller isn't surprised by a silent
price swap (PL/EN/CS/DE). Documented in the v1.9 version report.

Also adds leftover EN manual docs, the v9 AbacusAI deploy prompt, and a
local dev script to restore Postgres from a snapshot for testing against
real data.

Co-Authored-By: Claude Sonnet 5 <noreply@anthropic.com>
</commit_message>
<xml_diff>
--- a/Historia wersji oraz md/Historia wersji/AMSteel_Quote_Raport_Wersji_1.9.docx
+++ b/Historia wersji oraz md/Historia wersji/AMSteel_Quote_Raport_Wersji_1.9.docx
@@ -1888,7 +1888,7 @@
               <w:t xml:space="preserve"> Okres ważności oferty dostał te same gotowe przyciski (Q1–Q4/„Ten miesiąc”/„Niestandardowy”) co termin płatności, z domyślnym okresem i 2-dniowym terminem dla nowej oferty bez klienta; przywrócono też do stopki PDF linijkę o 48-godzinnej ważności oferty, teraz liczoną z wybranego terminu płatności zamiast na sztywno. Naprawiono też analogiczne do walutowego ucinanie bardzo dużych wartości tonażu w PDF.</w:t>
             </w:r>
             <w:r>
-              <w:t xml:space="preserve"> Okres ważności oferty: przyciski Q1–Q4 pokazują teraz tylko kwartały wybranego roku, które jeszcze się nie zakończyły – dla roku bieżącego znikają więc już minione kwartały (np. we wrześniu widoczne są tylko Q3 i Q4), tak by handlowiec nie mógł wystawić nowej oferty z okresem ważności całkowicie w przeszłości; nowo odslonięte kwartały po zmianie na kolejny rok pojawiają się z krótką animacją zamiast skokowo. Panel „Analiza” zyskał zamykalne plakietki aktywnego zawężenia (handlowiec/typ stali/status/decyzja klienta/firma) widoczne zarówno w zbiorczym pasku na górze, jak i przy powiązanym panelu oraz eksporcie do Excela. Panel „Handlowcy” administratora dostał zakładki filtrowania po roli z licznikiem kont, a lista ofert administratora pokazuje zamykalną plakietkę handlowca, gdy jest już zawężona do konkretnej osoby. Dodano przycisk „2” w wyborze terminu płatności (kalkulator, panel „Klienci”), tak by domyślny 2-dniowy termin nowej oferty pokazywał się jako gotowy wybór zamiast wartości wpisanej w polu „Inny”. Panel „Handlowcy” w Analizie zyskał też przełącznik filtrujący ranking wyników wg roli (Wszystko/młodszy handlowiec/starszy handlowiec/administrator), z przeliczeniem udziałów procentowych i wiersza „Razem” dla zawężonej grupy.</w:t>
+              <w:t xml:space="preserve"> Okres ważności oferty: przyciski Q1–Q4 pokazują teraz tylko kwartały wybranego roku, które jeszcze się nie zakończyły – dla roku bieżącego znikają więc już minione kwartały (np. we wrześniu widoczne są tylko Q3 i Q4), tak by handlowiec nie mógł wystawić nowej oferty z okresem ważności całkowicie w przeszłości; nowo odslonięte kwartały po zmianie na kolejny rok pojawiają się z krótką animacją zamiast skokowo. Panel „Analiza” zyskał zamykalne plakietki aktywnego zawężenia (handlowiec/typ stali/status/decyzja klienta/firma) widoczne zarówno w zbiorczym pasku na górze, jak i przy powiązanym panelu oraz eksporcie do Excela. Panel „Handlowcy” administratora dostał zakładki filtrowania po roli z licznikiem kont, a lista ofert administratora pokazuje zamykalną plakietkę handlowca, gdy jest już zawężona do konkretnej osoby. Dodano przycisk „2” w wyborze terminu płatności (kalkulator, panel „Klienci”), tak by domyślny 2-dniowy termin nowej oferty pokazywał się jako gotowy wybór zamiast wartości wpisanej w polu „Inny”. Panel „Handlowcy” w Analizie zyskał też przełącznik filtrujący ranking wyników wg roli (Wszystko/młodszy handlowiec/starszy handlowiec/administrator), z przeliczeniem udziałów procentowych i wiersza „Razem” dla zawężonej grupy. Dodano też w kalkulatorze krótką plakietkę informacyjną przy wyborze okresu ważności oferty na kwartał inny niż bieżący, gdy PGL zaplanowane na ten kwartał różni się od aktualnie obowiązującego, tak by handlowiec od razu widział, że wycena jedzie na innej cenie wsadu.</w:t>
             </w:r>
           </w:p>
         </w:tc>
@@ -16485,6 +16485,220 @@
             <w:proofErr w:type="spellStart"/>
             <w:r>
               <w:t>W wyborze terminu płatności (kalkulator, panel „Klienci” administratora oraz Starszego handlowca) dodano osobny przycisk „2” do istniejącego zestawu gotowych wartości dni (0/15/30/45/60/90/„Inny”). Domyślny 2-dniowy termin płatności nowej oferty bez wybranego klienta (wprowadzony wcześniej razem z okresem ważności „Ten miesiąc”) do tej pory nie miał odpowiadającego mu przycisku, więc przy otwarciu kalkulatora pokazywał się jako wartość wpisana ręcznie w polu „Inny” zamiast jako zaznaczony gotowy wybór.</w:t>
+            </w:r>
+            <w:proofErr w:type="spellEnd"/>
+            <w:proofErr w:type="spellStart"/>
+            <w:proofErr w:type="spellEnd"/>
+            <w:proofErr w:type="spellStart"/>
+            <w:proofErr w:type="spellEnd"/>
+            <w:proofErr w:type="spellStart"/>
+            <w:proofErr w:type="spellEnd"/>
+            <w:proofErr w:type="spellStart"/>
+            <w:proofErr w:type="spellEnd"/>
+            <w:proofErr w:type="spellStart"/>
+            <w:proofErr w:type="spellEnd"/>
+            <w:proofErr w:type="spellStart"/>
+            <w:proofErr w:type="spellEnd"/>
+            <w:proofErr w:type="spellStart"/>
+            <w:proofErr w:type="spellEnd"/>
+            <w:proofErr w:type="spellStart"/>
+            <w:proofErr w:type="spellEnd"/>
+            <w:proofErr w:type="spellStart"/>
+            <w:proofErr w:type="spellEnd"/>
+            <w:proofErr w:type="spellStart"/>
+            <w:proofErr w:type="spellEnd"/>
+            <w:proofErr w:type="spellStart"/>
+            <w:proofErr w:type="spellEnd"/>
+            <w:proofErr w:type="spellStart"/>
+            <w:proofErr w:type="spellEnd"/>
+            <w:proofErr w:type="spellStart"/>
+            <w:proofErr w:type="spellEnd"/>
+            <w:proofErr w:type="spellStart"/>
+            <w:proofErr w:type="spellEnd"/>
+            <w:proofErr w:type="spellStart"/>
+            <w:proofErr w:type="spellEnd"/>
+            <w:proofErr w:type="spellStart"/>
+            <w:proofErr w:type="spellEnd"/>
+            <w:proofErr w:type="spellStart"/>
+            <w:proofErr w:type="spellEnd"/>
+            <w:proofErr w:type="spellStart"/>
+            <w:proofErr w:type="spellEnd"/>
+            <w:proofErr w:type="spellStart"/>
+            <w:proofErr w:type="spellEnd"/>
+            <w:proofErr w:type="spellStart"/>
+            <w:proofErr w:type="spellEnd"/>
+            <w:proofErr w:type="spellStart"/>
+            <w:proofErr w:type="spellEnd"/>
+            <w:proofErr w:type="spellStart"/>
+            <w:proofErr w:type="spellEnd"/>
+            <w:proofErr w:type="spellStart"/>
+            <w:proofErr w:type="spellEnd"/>
+            <w:proofErr w:type="spellStart"/>
+            <w:proofErr w:type="spellEnd"/>
+            <w:proofErr w:type="spellStart"/>
+            <w:proofErr w:type="spellEnd"/>
+            <w:proofErr w:type="spellStart"/>
+            <w:proofErr w:type="spellEnd"/>
+            <w:proofErr w:type="spellStart"/>
+            <w:proofErr w:type="spellEnd"/>
+            <w:proofErr w:type="spellStart"/>
+            <w:proofErr w:type="spellEnd"/>
+            <w:proofErr w:type="spellStart"/>
+            <w:proofErr w:type="spellEnd"/>
+            <w:proofErr w:type="spellStart"/>
+            <w:proofErr w:type="spellEnd"/>
+            <w:proofErr w:type="spellStart"/>
+            <w:proofErr w:type="spellEnd"/>
+            <w:proofErr w:type="spellStart"/>
+            <w:proofErr w:type="spellEnd"/>
+            <w:proofErr w:type="spellStart"/>
+            <w:proofErr w:type="spellEnd"/>
+            <w:proofErr w:type="spellStart"/>
+            <w:proofErr w:type="spellEnd"/>
+            <w:proofErr w:type="spellStart"/>
+            <w:proofErr w:type="spellEnd"/>
+            <w:proofErr w:type="spellStart"/>
+            <w:proofErr w:type="spellEnd"/>
+            <w:proofErr w:type="spellStart"/>
+            <w:proofErr w:type="spellEnd"/>
+            <w:proofErr w:type="spellStart"/>
+            <w:proofErr w:type="spellEnd"/>
+            <w:proofErr w:type="spellStart"/>
+            <w:proofErr w:type="spellEnd"/>
+            <w:proofErr w:type="spellStart"/>
+            <w:proofErr w:type="spellEnd"/>
+            <w:proofErr w:type="spellStart"/>
+            <w:proofErr w:type="spellEnd"/>
+            <w:proofErr w:type="spellStart"/>
+            <w:proofErr w:type="spellEnd"/>
+            <w:proofErr w:type="spellStart"/>
+            <w:proofErr w:type="spellEnd"/>
+            <w:proofErr w:type="spellStart"/>
+            <w:proofErr w:type="spellEnd"/>
+            <w:proofErr w:type="spellStart"/>
+            <w:proofErr w:type="spellEnd"/>
+            <w:proofErr w:type="spellStart"/>
+            <w:proofErr w:type="spellEnd"/>
+            <w:proofErr w:type="spellStart"/>
+            <w:proofErr w:type="spellEnd"/>
+            <w:proofErr w:type="spellStart"/>
+            <w:proofErr w:type="spellEnd"/>
+            <w:proofErr w:type="spellStart"/>
+            <w:proofErr w:type="spellEnd"/>
+            <w:proofErr w:type="spellStart"/>
+            <w:proofErr w:type="spellEnd"/>
+            <w:proofErr w:type="spellStart"/>
+            <w:proofErr w:type="spellEnd"/>
+            <w:proofErr w:type="spellStart"/>
+            <w:proofErr w:type="spellEnd"/>
+            <w:proofErr w:type="spellStart"/>
+            <w:proofErr w:type="spellEnd"/>
+            <w:proofErr w:type="spellStart"/>
+            <w:proofErr w:type="spellEnd"/>
+            <w:proofErr w:type="spellStart"/>
+            <w:proofErr w:type="spellEnd"/>
+            <w:proofErr w:type="spellStart"/>
+            <w:proofErr w:type="spellEnd"/>
+            <w:proofErr w:type="spellStart"/>
+            <w:proofErr w:type="spellEnd"/>
+            <w:proofErr w:type="spellStart"/>
+            <w:proofErr w:type="spellEnd"/>
+            <w:proofErr w:type="spellStart"/>
+            <w:proofErr w:type="spellEnd"/>
+            <w:proofErr w:type="spellStart"/>
+            <w:proofErr w:type="spellEnd"/>
+            <w:proofErr w:type="spellStart"/>
+            <w:proofErr w:type="spellEnd"/>
+            <w:proofErr w:type="spellStart"/>
+            <w:proofErr w:type="spellEnd"/>
+            <w:proofErr w:type="spellStart"/>
+            <w:proofErr w:type="spellEnd"/>
+            <w:proofErr w:type="spellStart"/>
+            <w:proofErr w:type="spellEnd"/>
+            <w:proofErr w:type="spellStart"/>
+            <w:proofErr w:type="spellEnd"/>
+            <w:proofErr w:type="spellStart"/>
+            <w:proofErr w:type="spellEnd"/>
+            <w:proofErr w:type="spellStart"/>
+            <w:proofErr w:type="spellEnd"/>
+            <w:proofErr w:type="spellStart"/>
+            <w:proofErr w:type="spellEnd"/>
+            <w:proofErr w:type="spellStart"/>
+            <w:proofErr w:type="spellEnd"/>
+            <w:proofErr w:type="spellStart"/>
+            <w:proofErr w:type="spellEnd"/>
+            <w:proofErr w:type="spellStart"/>
+            <w:proofErr w:type="spellEnd"/>
+            <w:proofErr w:type="spellStart"/>
+            <w:proofErr w:type="spellEnd"/>
+            <w:proofErr w:type="spellStart"/>
+            <w:proofErr w:type="spellEnd"/>
+            <w:proofErr w:type="spellStart"/>
+            <w:proofErr w:type="spellEnd"/>
+            <w:proofErr w:type="spellStart"/>
+            <w:proofErr w:type="spellEnd"/>
+            <w:proofErr w:type="spellStart"/>
+            <w:proofErr w:type="spellEnd"/>
+            <w:proofErr w:type="spellStart"/>
+            <w:proofErr w:type="spellEnd"/>
+            <w:proofErr w:type="spellStart"/>
+            <w:proofErr w:type="spellEnd"/>
+            <w:proofErr w:type="spellStart"/>
+            <w:proofErr w:type="spellEnd"/>
+            <w:proofErr w:type="spellStart"/>
+            <w:proofErr w:type="spellEnd"/>
+            <w:proofErr w:type="spellStart"/>
+            <w:proofErr w:type="spellEnd"/>
+            <w:proofErr w:type="spellStart"/>
+            <w:proofErr w:type="spellEnd"/>
+            <w:proofErr w:type="spellStart"/>
+            <w:proofErr w:type="spellEnd"/>
+            <w:proofErr w:type="spellStart"/>
+            <w:proofErr w:type="spellEnd"/>
+            <w:proofErr w:type="spellStart"/>
+            <w:proofErr w:type="spellEnd"/>
+            <w:proofErr w:type="spellStart"/>
+            <w:proofErr w:type="spellEnd"/>
+            <w:proofErr w:type="spellStart"/>
+            <w:proofErr w:type="spellEnd"/>
+            <w:proofErr w:type="spellStart"/>
+            <w:proofErr w:type="spellEnd"/>
+            <w:proofErr w:type="spellStart"/>
+            <w:proofErr w:type="spellEnd"/>
+            <w:proofErr w:type="spellStart"/>
+            <w:proofErr w:type="spellEnd"/>
+            <w:proofErr w:type="spellStart"/>
+            <w:proofErr w:type="spellEnd"/>
+            <w:proofErr w:type="spellStart"/>
+            <w:proofErr w:type="spellEnd"/>
+            <w:proofErr w:type="spellStart"/>
+            <w:proofErr w:type="spellEnd"/>
+            <w:proofErr w:type="spellStart"/>
+            <w:proofErr w:type="spellEnd"/>
+          </w:p>
+        </w:tc>
+      </w:tr>
+      <w:tr>
+        <w:tc>
+          <w:tcPr>
+            <w:tcW w:w="1948" w:type="dxa"/>
+          </w:tcPr>
+          <w:p>
+            <w:proofErr w:type="spellStart"/>
+            <w:r>
+              <w:t>Nowa funkcja</w:t>
+            </w:r>
+            <w:proofErr w:type="spellEnd"/>
+          </w:p>
+        </w:tc>
+        <w:tc>
+          <w:tcPr>
+            <w:tcW w:w="6908" w:type="dxa"/>
+          </w:tcPr>
+          <w:p>
+            <w:proofErr w:type="spellStart"/>
+            <w:r>
+              <w:t>Przy wyborze okresu ważności oferty (Q1–Q4/„Ten miesiąc”/„Niestandardowy”) kalkulator pokazuje teraz krótką informacyjną plakietkę, gdy wybrany kwartał NIE jest bieżącym i ma inną zaplanowaną cenę PGL niż aktualnie obowiązująca (np. „Uwaga: tworzysz ofertę na Q4 2026 — PGL na ten kwartał jest ustawione na inną cenę niż bieżąca (X €/t)”) – PGL dla wybranego kwartału i tak był dobierany automatycznie (mechanizm harmonogramu kwartalnego z wersji 1.8), ale handlowiec nie miał wcześniej żadnego widocznego sygnału, że cena różni się od tej z bieżącego kwartału. Plakietka jest czysto informacyjna (niczego nie blokuje) i chowa się automatycznie po powrocie do bieżącego kwartału albo po zmianie typu stali. Dostępna we wszystkich 4 językach interfejsu (PL/EN/CS/DE).</w:t>
             </w:r>
             <w:proofErr w:type="spellEnd"/>
             <w:proofErr w:type="spellStart"/>

</xml_diff>

<commit_message>
docs: add v1.9 report entries for transport button + PWA install banner
Documents the two latest changes: the bolder, clearly-clickable Route &
Transport toggle in the calculator, and the new Android-only PWA install
banner on the login screen. Also extends the master version-history
summary row for 1.9 to mention both.

Co-Authored-By: Claude Sonnet 5 <noreply@anthropic.com>
</commit_message>
<xml_diff>
--- a/Historia wersji oraz md/Historia wersji/AMSteel_Quote_Raport_Wersji_1.9.docx
+++ b/Historia wersji oraz md/Historia wersji/AMSteel_Quote_Raport_Wersji_1.9.docx
@@ -322,8 +322,7 @@
               <w:t xml:space="preserve">i naprawiono zawijanie się symbolu waluty w PDF przy bardzo dużych kwotach (powyżej 1 000 000 €). Okres ważności oferty dostał te same gotowe przyciski (Q1–Q4/„Ten miesiąc”/„Niestandardowy”) co termin płatności, z domyślnym okresem i 2-dniowym terminem dla nowej oferty bez klienta; przywrócono też do stopki PDF linijkę o 48-godzinnej ważności oferty, teraz liczoną z wybranego terminu płatności zamiast na sztywno. Naprawiono też analogiczne do walutowego ucinanie bardzo dużych wartości tonażu w PDF. Okres ważności oferty: przyciski Q1–Q4 pokazują teraz tylko kwartały wybranego roku, które jeszcze się nie zakończyły – dla roku bieżącego znikają więc już minione kwartały (np. we wrześniu widoczne są tylko Q3 i Q4), tak by handlowiec nie mógł wystawić nowej oferty z okresem ważności całkowicie w przeszłości; nowo odslonięte kwartały po zmianie na kolejny rok pojawiają się z krótką animacją zamiast skokowo. Panel „Analiza” zyskał zamykalne plakietki </w:t>
             </w:r>
             <w:r>
-              <w:lastRenderedPageBreak/>
-              <w:t>aktywnego zawężenia (handlowiec/typ stali/status/decyzja klienta/firma) widoczne zarówno w zbiorczym pasku na górze, jak i przy powiązanym panelu oraz eksporcie do Excela. Panel „Handlowcy” administratora dostał zakładki filtrowania po roli z licznikiem kont, a lista ofert administratora pokazuje zamykalną plakietkę handlowca, gdy jest już zawężona do konkretnej osoby. Dodano przycisk „2” w wyborze terminu płatności (kalkulator, panel „Klienci”), tak by domyślny 2-dniowy termin nowej oferty pokazywał się jako gotowy wybór zamiast wartości wpisanej w polu „Inny”. Panel „Handlowcy” w Analizie zyskał też przełącznik filtrujący ranking wyników wg roli (Wszystko/młodszy handlowiec/starszy handlowiec/administrator), z przeliczeniem udziałów procentowych i wiersza „Razem” dla zawężonej grupy. Dodano też w kalkulatorze krótką plakietkę informacyjną przy wyborze okresu ważności oferty na kwartał inny niż bieżący, gdy PGL zaplanowane na ten kwartał różni się od aktualnie obowiązującego, tak by handlowiec od razu widział, że wycena jedzie na innej cenie wsadu.</w:t>
+              <w:t>aktywnego zawężenia (handlowiec/typ stali/status/decyzja klienta/firma) widoczne zarówno w zbiorczym pasku na górze, jak i przy powiązanym panelu oraz eksporcie do Excela. Panel „Handlowcy” administratora dostał zakładki filtrowania po roli z licznikiem kont, a lista ofert administratora pokazuje zamykalną plakietkę handlowca, gdy jest już zawężona do konkretnej osoby. Dodano przycisk „2” w wyborze terminu płatności (kalkulator, panel „Klienci”), tak by domyślny 2-dniowy termin nowej oferty pokazywał się jako gotowy wybór zamiast wartości wpisanej w polu „Inny”. Panel „Handlowcy” w Analizie zyskał też przełącznik filtrujący ranking wyników wg roli (Wszystko/młodszy handlowiec/starszy handlowiec/administrator), z przeliczeniem udziałów procentowych i wiersza „Razem” dla zawężonej grupy. Dodano też w kalkulatorze krótką plakietkę informacyjną przy wyborze okresu ważności oferty na kwartał inny niż bieżący, gdy PGL zaplanowane na ten kwartał różni się od aktualnie obowiązującego, tak by handlowiec od razu widział, że wycena jedzie na innej cenie wsadu. Dodano też podstawową infrastrukturę PWA (manifest, ikony, service worker) z plakietką instalacji aplikacji widoczną wyłącznie na ekranie logowania na telefonach z Androidem, znikającą automatycznie po zalogowaniu. Nagłówek sekcji „Trasa i transport” w Zestawieniu wyróżniono pogrubieniem i kolorem akcentu, żeby było wyraźniej widać, że to klikalny przycisk rozwijający panel.</w:t>
             </w:r>
           </w:p>
         </w:tc>
@@ -902,6 +901,28 @@
           </w:p>
         </w:tc>
       </w:tr>
+      <w:tr>
+        <w:tc>
+          <w:tcPr>
+            <w:tcW w:w="1948" w:type="dxa"/>
+          </w:tcPr>
+          <w:p>
+            <w:r>
+              <w:t>Nowa funkcja</w:t>
+            </w:r>
+          </w:p>
+        </w:tc>
+        <w:tc>
+          <w:tcPr>
+            <w:tcW w:w="6908" w:type="dxa"/>
+          </w:tcPr>
+          <w:p>
+            <w:r>
+              <w:t>Dodano podstawową infrastrukturę PWA (manifest.json, komplet ikon aplikacji, minimalny service worker) oraz plakietkę zachęcającą do instalacji aplikacji na ekranie logowania - widoczną wyłącznie na telefonach z systemem Android (wykrywanie po user agent przeglądarki, wykorzystanie natywnego zdarzenia przeglądarki beforeinstallprompt), która znika automatycznie po zalogowaniu się (komponent istnieje wyłącznie na ekranie logowania) i nie pojawia się ponownie przez 7 dni po odrzuceniu przyciskiem „Nie teraz”. Dostępna we wszystkich 4 językach interfejsu aplikacji (PL/EN/CS/DE).</w:t>
+            </w:r>
+          </w:p>
+        </w:tc>
+      </w:tr>
     </w:tbl>
     <w:p>
       <w:pPr>
@@ -1082,6 +1103,28 @@
           <w:p>
             <w:r>
               <w:t>Przy wyborze okresu ważności oferty (Q1–Q4/„Ten miesiąc”/„Niestandardowy”) kalkulator pokazuje teraz krótką informacyjną plakietkę, gdy wybrany kwartał NIE jest bieżącym i ma inną zaplanowaną cenę PGL niż aktualnie obowiązująca (np. „Uwaga: tworzysz ofertę na Q4 2026 — PGL na ten kwartał jest ustawione na inną cenę niż bieżąca (X €/t)”) – PGL dla wybranego kwartału i tak był dobierany automatycznie (mechanizm harmonogramu kwartalnego z wersji 1.8), ale handlowiec nie miał wcześniej żadnego widocznego sygnału, że cena różni się od tej z bieżącego kwartału. Plakietka jest czysto informacyjna (niczego nie blokuje) i chowa się automatycznie po powrocie do bieżącego kwartału albo po zmianie typu stali. Dostępna we wszystkich 4 językach interfejsu (PL/EN/CS/DE).</w:t>
+            </w:r>
+          </w:p>
+        </w:tc>
+      </w:tr>
+      <w:tr>
+        <w:tc>
+          <w:tcPr>
+            <w:tcW w:w="1948" w:type="dxa"/>
+          </w:tcPr>
+          <w:p>
+            <w:r>
+              <w:t>Zmiana</w:t>
+            </w:r>
+          </w:p>
+        </w:tc>
+        <w:tc>
+          <w:tcPr>
+            <w:tcW w:w="6908" w:type="dxa"/>
+          </w:tcPr>
+          <w:p>
+            <w:r>
+              <w:t>Nagłówek rozwijanej sekcji „Trasa i transport” w Zestawieniu (przycisk otwierający/zwijający panel) wyróżniono pogrubieniem, kolorem akcentu i wyraźną ramką z podświetleniem przy najechaniu kursorem - wcześniej był to zwykły, przygaszony tekst nieodróżniający się wizualnie od reszty panelu, przez co część handlowców nie zauważała, że to klikalny przycisk rozwijający formularz trasy i kosztu transportu.</w:t>
             </w:r>
           </w:p>
         </w:tc>

</xml_diff>

<commit_message>
docs: question 2.10 on re-routing approvals; v1.9 report date fix
questions_for_lukasz.md: new 2.10 - approvals re-check the current rules
and may move an offer up; should legacy offers waiting since the 1.x
model still be approvable by ASM? Also carries the collected answers.
v1.9 report: final report date 25.09.2026 and post-1.9-deploy test plan.

Co-Authored-By: Claude Opus 5.5 <noreply@anthropic.com>
</commit_message>
<xml_diff>
--- a/Historia wersji oraz md/Historia wersji/AMSteel_Quote_Raport_Wersji_1.9.docx
+++ b/Historia wersji oraz md/Historia wersji/AMSteel_Quote_Raport_Wersji_1.9.docx
@@ -121,7 +121,13 @@
               <w:t xml:space="preserve">.09.2026 - </w:t>
             </w:r>
             <w:r>
-              <w:t>24.09.2026</w:t>
+              <w:t>2</w:t>
+            </w:r>
+            <w:r>
+              <w:t>5</w:t>
+            </w:r>
+            <w:r>
+              <w:t>.09.2026</w:t>
             </w:r>
           </w:p>
         </w:tc>
@@ -147,7 +153,10 @@
           </w:tcPr>
           <w:p>
             <w:r>
-              <w:t>24</w:t>
+              <w:t>2</w:t>
+            </w:r>
+            <w:r>
+              <w:t>5</w:t>
             </w:r>
             <w:r>
               <w:t>.</w:t>
@@ -283,7 +292,13 @@
               <w:t>21.09.2026 -</w:t>
             </w:r>
             <w:r>
-              <w:t xml:space="preserve"> 24.09.2026</w:t>
+              <w:t xml:space="preserve"> 2</w:t>
+            </w:r>
+            <w:r>
+              <w:t>5</w:t>
+            </w:r>
+            <w:r>
+              <w:t>.09.2026</w:t>
             </w:r>
           </w:p>
         </w:tc>
@@ -293,7 +308,13 @@
           </w:tcPr>
           <w:p>
             <w:r>
-              <w:t>24.09.2026</w:t>
+              <w:t>2</w:t>
+            </w:r>
+            <w:r>
+              <w:t>5</w:t>
+            </w:r>
+            <w:r>
+              <w:t>.09.2026</w:t>
             </w:r>
           </w:p>
         </w:tc>
@@ -322,6 +343,7 @@
               <w:t xml:space="preserve">i naprawiono zawijanie się symbolu waluty w PDF przy bardzo dużych kwotach (powyżej 1 000 000 €). Okres ważności oferty dostał te same gotowe przyciski (Q1–Q4/„Ten miesiąc”/„Niestandardowy”) co termin płatności, z domyślnym okresem i 2-dniowym terminem dla nowej oferty bez klienta; przywrócono też do stopki PDF linijkę o 48-godzinnej ważności oferty, teraz liczoną z wybranego terminu płatności zamiast na sztywno. Naprawiono też analogiczne do walutowego ucinanie bardzo dużych wartości tonażu w PDF. Okres ważności oferty: przyciski Q1–Q4 pokazują teraz tylko kwartały wybranego roku, które jeszcze się nie zakończyły – dla roku bieżącego znikają więc już minione kwartały (np. we wrześniu widoczne są tylko Q3 i Q4), tak by handlowiec nie mógł wystawić nowej oferty z okresem ważności całkowicie w przeszłości; nowo odslonięte kwartały po zmianie na kolejny rok pojawiają się z krótką animacją zamiast skokowo. Panel „Analiza” zyskał zamykalne plakietki </w:t>
             </w:r>
             <w:r>
+              <w:lastRenderedPageBreak/>
               <w:t>aktywnego zawężenia (handlowiec/typ stali/status/decyzja klienta/firma) widoczne zarówno w zbiorczym pasku na górze, jak i przy powiązanym panelu oraz eksporcie do Excela. Panel „Handlowcy” administratora dostał zakładki filtrowania po roli z licznikiem kont, a lista ofert administratora pokazuje zamykalną plakietkę handlowca, gdy jest już zawężona do konkretnej osoby. Dodano przycisk „2” w wyborze terminu płatności (kalkulator, panel „Klienci”), tak by domyślny 2-dniowy termin nowej oferty pokazywał się jako gotowy wybór zamiast wartości wpisanej w polu „Inny”. Panel „Handlowcy” w Analizie zyskał też przełącznik filtrujący ranking wyników wg roli (Wszystko/młodszy handlowiec/starszy handlowiec/administrator), z przeliczeniem udziałów procentowych i wiersza „Razem” dla zawężonej grupy. Dodano też w kalkulatorze krótką plakietkę informacyjną przy wyborze okresu ważności oferty na kwartał inny niż bieżący, gdy PGL zaplanowane na ten kwartał różni się od aktualnie obowiązującego, tak by handlowiec od razu widział, że wycena jedzie na innej cenie wsadu. Dodano też podstawową infrastrukturę PWA (manifest, ikony, service worker) z plakietką instalacji aplikacji widoczną wyłącznie na ekranie logowania na telefonach z Androidem, znikającą automatycznie po zalogowaniu. Nagłówek sekcji „Trasa i transport” w Zestawieniu wyróżniono pogrubieniem i kolorem akcentu, żeby było wyraźniej widać, że to klikalny przycisk rozwijający panel.</w:t>
             </w:r>
           </w:p>
@@ -377,25 +399,25 @@
           </w:tcPr>
           <w:p>
             <w:r>
-              <w:t xml:space="preserve">Dodano opcjonalny komentarz do pozycji z niezerową dopłatą dodatkową w kalkulatorze. Pole komentarza oraz osobny checkbox „Dołącz komentarz do PDF” pojawiają się dopiero po wpisaniu wartości różnej od zera, a treść zapisuje się razem z resztą konfiguracji pozycji (odtwarzana przy edycji, nieusuwana przy chwilowym wyzerowaniu dopłaty). Po zaznaczeniu checkboxa komentarz trafia jako dodatkowy wpis do kolumny „Uwagi” w PDF oferty, we wszystkich miejscach eksportu (kalkulator, Moje oferty, Panel seniora, Panel administratora). </w:t>
+              <w:t xml:space="preserve">Dodano opcjonalny komentarz do pozycji z niezerową dopłatą dodatkową w kalkulatorze. Pole komentarza oraz osobny checkbox „Dołącz komentarz do PDF” pojawiają </w:t>
             </w:r>
             <w:r>
               <w:lastRenderedPageBreak/>
-              <w:t xml:space="preserve">Dodano również gatunek jednorazowy - możliwość wyceny gatunku spoza cennika (nazwa + dopłata EUR/t) w obrębie jednej oferty, bez dopisywania go do cennika i bez wpływu na pozostałe oferty. Dodano też opcję odbioru własnego w transporcie - checkbox w panelu „Trasa i transport” ustawia transport na 0 €/t, gdy klient sam odbiera towar spod zakładu. Dodano też harmonogram kwartalny PGL bazowego: administrator planuje ceny na Q1–Q4 wybranego roku osobno dla każdego typu stali, a kalkulator przełącza się na cenę danego kwartału automatycznie z chwilą jego rozpoczęcia. Tabela w panelu administratora pokazuje obok siebie cenę bieżącego miesiąca i wszystkie cztery kwartały. Funkcja wymaga migracji bazy danych (021_create_pgl_quarterly_prices.sql). Poprawiono też zapis ustawień, który przy aktywnej cenie kwartalnej nadpisywał nią ręczną cenę bazową PGL, oraz zaktualizowano dokumentację repozytorium (README, opis „About” na GitHubie, zrzuty ekranu kalkulatora) i numer wersji w nagłówku aplikacji do v1.8. Cały panel kalkulacji zyskał też zwijanie/rozwijanie jednym kliknięciem, analogicznie do panelu Danych Klienta. Ostrzeżenia o PGL poniżej bazy i marży poniżej minimum stały się też wyraźnie widoczne - zamiast drobnego żółtego tekstu pokazują się teraz jako czerwono obramowany, pogrubiony komunikat. Złom w podsumowaniu SSC przestał być stałą kwotą 10 €/t - jest teraz % ceny wsadu (domyślnie 2%), konfigurowalny przez administratora w Ustawieniach. Poprawiono też historię zmian cen bazowych PGL, która nie rejestrowała zmian wprowadzanych przez harmonogram </w:t>
+              <w:t xml:space="preserve">się dopiero po wpisaniu wartości różnej od zera, a treść zapisuje się razem z resztą konfiguracji pozycji (odtwarzana przy edycji, nieusuwana przy chwilowym wyzerowaniu dopłaty). Po zaznaczeniu checkboxa komentarz trafia jako dodatkowy wpis do kolumny „Uwagi” w PDF oferty, we wszystkich miejscach eksportu (kalkulator, Moje oferty, Panel seniora, Panel administratora). Dodano również gatunek jednorazowy - możliwość wyceny gatunku spoza cennika (nazwa + dopłata EUR/t) w obrębie jednej oferty, bez dopisywania go do cennika i bez wpływu na pozostałe oferty. Dodano też opcję odbioru własnego w transporcie - checkbox w panelu „Trasa i transport” ustawia transport na 0 €/t, gdy klient sam odbiera towar spod zakładu. Dodano też harmonogram kwartalny PGL bazowego: administrator planuje ceny na Q1–Q4 wybranego roku osobno dla każdego typu stali, a kalkulator przełącza się na cenę danego kwartału automatycznie z chwilą jego rozpoczęcia. Tabela w panelu administratora pokazuje obok siebie cenę bieżącego miesiąca i wszystkie cztery kwartały. Funkcja wymaga migracji bazy danych (021_create_pgl_quarterly_prices.sql). Poprawiono też zapis ustawień, który przy aktywnej cenie kwartalnej nadpisywał nią ręczną cenę bazową PGL, oraz zaktualizowano dokumentację repozytorium (README, opis „About” na GitHubie, zrzuty ekranu kalkulatora) i numer wersji w nagłówku aplikacji do v1.8. Cały panel kalkulacji zyskał też zwijanie/rozwijanie jednym kliknięciem, analogicznie do panelu Danych Klienta. Ostrzeżenia o PGL poniżej bazy i marży poniżej minimum stały się też wyraźnie widoczne - </w:t>
             </w:r>
             <w:r>
               <w:lastRenderedPageBreak/>
-              <w:t xml:space="preserve">kwartalny (edycję ceny bieżącego kwartału) - teraz trafiają do tego samego logu co ręczne zmiany. Dodano też okres ważności oferty: pola „Ważna od”/„Ważna do” obok przełącznika Arkusz/Krąg. Kwartał wyznaczony z daty „Ważna od” automatycznie dobiera PGL bazowe zaplanowane w harmonogramie kwartalnym dla tego okresu, tą samą logiką co dotychczasowe przełączanie na bieżący kwartał - tylko sparametryzowaną wybranym okresem zamiast „teraz”. Gdy zakres „od”–„do” wykracza poza jeden kwartał, PGL nie jest dobierane automatycznie i pojawia się czerwone ostrzeżenie. Wybrany zakres dat trafia też dodatkowo do stopki PDF oferty, obok dotychczasowej formułki o 48-godzinnej ważności oferty. Kwota złomu w podsumowaniu SSC jest teraz zaokrąglana do liczby całkowitej, na polecenie </w:t>
+              <w:t xml:space="preserve">zamiast drobnego żółtego tekstu pokazują się teraz jako czerwono obramowany, pogrubiony komunikat. Złom w podsumowaniu SSC przestał być stałą kwotą 10 €/t - jest teraz % ceny wsadu (domyślnie 2%), konfigurowalny przez administratora w Ustawieniach. Poprawiono też historię zmian cen bazowych PGL, która nie rejestrowała zmian wprowadzanych przez harmonogram kwartalny (edycję ceny bieżącego kwartału) - teraz trafiają do tego samego logu co ręczne zmiany. Dodano też okres ważności oferty: pola „Ważna od”/„Ważna do” obok przełącznika Arkusz/Krąg. Kwartał wyznaczony z daty „Ważna od” automatycznie dobiera PGL bazowe zaplanowane w harmonogramie kwartalnym dla tego okresu, tą samą logiką co dotychczasowe przełączanie na bieżący kwartał - tylko sparametryzowaną wybranym okresem zamiast „teraz”. Gdy zakres „od”–„do” wykracza poza jeden kwartał, PGL nie jest dobierane automatycznie i pojawia się czerwone ostrzeżenie. Wybrany zakres dat trafia też dodatkowo do stopki PDF oferty, obok dotychczasowej formułki o 48-godzinnej ważności oferty. Kwota złomu w podsumowaniu SSC jest teraz zaokrąglana do liczby całkowitej, na polecenie </w:t>
             </w:r>
             <w:r>
               <w:t>Łukasza</w:t>
             </w:r>
             <w:r>
-              <w:t xml:space="preserve">. Dodano też termin płatności: osobna para pól „od”/„do” obok okresu ważności oferty, gdzie „do” domyślnie dolicza się jako „od” + termin klienta (konfigurowalny w panelu Klienci, dostępnym też dla starszego handlowca) albo globalny domyślny z Ustawień (domyślnie 7 dni), z możliwością ręcznej zmiany; ustawiony termin trafia też do stopki PDF, zastępując ogólną formułkę o warunkach płatności. Poprawiono też PDF oferty: podsumowanie sumy przestało powtarzać się po każdej stronie tabeli pozycji (pokazuje się teraz raz, po ostatniej pozycji), a tekst w kolumnach „Cena”/„Wartość” przestał się rozjeżdżać przy pięciocyfrowych kwotach. W zestawieniu pozycji doszła możliwość zmiany kolejności wierszy przeciąganiem za uchwyt, z automatycznym przeliczeniem numeracji „Lp.” i płynną animacją przesuwania pozostałych pozycji - </w:t>
+              <w:t xml:space="preserve">. Dodano też termin płatności: osobna para pól „od”/„do” obok okresu ważności oferty, gdzie „do” domyślnie dolicza się jako „od” + termin klienta (konfigurowalny w panelu Klienci, dostępnym też dla starszego handlowca) albo globalny domyślny z Ustawień (domyślnie 7 dni), z możliwością ręcznej zmiany; ustawiony termin trafia też do stopki PDF, zastępując ogólną formułkę o warunkach płatności. Poprawiono też PDF oferty: podsumowanie sumy przestało powtarzać się po każdej </w:t>
             </w:r>
             <w:r>
               <w:lastRenderedPageBreak/>
-              <w:t>nowa kolejność obowiązuje też w PDF, Excelu i zapisanej ofercie; funkcja działa również dotykiem na telefonie i tablecie, nie tylko myszką. Podsumowanie zestawienia pozycji pokazuje teraz również łączną liczbę ton, wyrównaną w wierszu podsumowującym dokładnie pod kolumnami „Tony” i „Wartość” tabeli. Dodano też migrację przeterminowanego PGL: otwarcie do edycji zapisanej oferty (albo świeżo zduplikowanej kopii) wycenionej w innym kwartale niż bieżący automatycznie aktualizuje PGL bazowe, PGL/marżę/cenę każdej pozycji zestawienia oraz okres ważności do dzisiejszej daty, z wyraźnym banerem informującym o zmianie i liczbie przeliczonych pozycji; nic nie zapisuje się do bazy bez ręcznego zapisania oferty.</w:t>
+              <w:t>stronie tabeli pozycji (pokazuje się teraz raz, po ostatniej pozycji), a tekst w kolumnach „Cena”/„Wartość” przestał się rozjeżdżać przy pięciocyfrowych kwotach. W zestawieniu pozycji doszła możliwość zmiany kolejności wierszy przeciąganiem za uchwyt, z automatycznym przeliczeniem numeracji „Lp.” i płynną animacją przesuwania pozostałych pozycji - nowa kolejność obowiązuje też w PDF, Excelu i zapisanej ofercie; funkcja działa również dotykiem na telefonie i tablecie, nie tylko myszką. Podsumowanie zestawienia pozycji pokazuje teraz również łączną liczbę ton, wyrównaną w wierszu podsumowującym dokładnie pod kolumnami „Tony” i „Wartość” tabeli. Dodano też migrację przeterminowanego PGL: otwarcie do edycji zapisanej oferty (albo świeżo zduplikowanej kopii) wycenionej w innym kwartale niż bieżący automatycznie aktualizuje PGL bazowe, PGL/marżę/cenę każdej pozycji zestawienia oraz okres ważności do dzisiejszej daty, z wyraźnym banerem informującym o zmianie i liczbie przeliczonych pozycji; nic nie zapisuje się do bazy bez ręcznego zapisania oferty.</w:t>
             </w:r>
           </w:p>
         </w:tc>
@@ -438,11 +460,11 @@
           </w:tcPr>
           <w:p>
             <w:r>
-              <w:t xml:space="preserve">Naprawiono błąd zapisu decyzji klienta (wygrana / przegrana) na ofercie wysłanej - konflikt typów parametru w zapytaniu SQL (kod 42P08); wcześniej funkcja nie zapisywała żadnej decyzji. Zablokowano wysyłkę oferty do klienta bez danych firmy klienta (nazwa firmy i NIP) - tworzenie i zapis oferty bez tych danych nadal działają. Senior może zbudować zespół z juniorów (sekcja „Mój zespół” w panelu seniora i administratora), a panel „Analiza” pokazuje mu wtedy dane własne oraz całego zespołu, z możliwością zawężenia do siebie lub wybranego juniora. Eksport ofert, panelu „Analiza” i historii PGL do Excela otwiera się teraz z kolumnami dopasowanymi do zawartości, bez ręcznego rozciągania. Dodano automatyczne liczenie transportu z trasy dostawy: rzeczywista odległość drogowa do klienta, cennik przewoźnika w pasmach kilometrowych, przeliczanie na kursy </w:t>
+              <w:t xml:space="preserve">Naprawiono błąd zapisu decyzji klienta (wygrana / przegrana) na ofercie wysłanej - konflikt typów parametru w zapytaniu SQL (kod 42P08); wcześniej funkcja nie zapisywała żadnej decyzji. Zablokowano wysyłkę oferty do klienta bez danych firmy klienta (nazwa firmy i NIP) - tworzenie i zapis oferty bez tych danych nadal działają. Senior może zbudować zespół z juniorów (sekcja „Mój zespół” w panelu seniora i administratora), a panel „Analiza” pokazuje mu wtedy dane własne oraz całego zespołu, z </w:t>
             </w:r>
             <w:r>
               <w:lastRenderedPageBreak/>
-              <w:t>według ładowności 21 t i dopłaty za elementy ponadwymiarowe, wraz z edytowalnym cennikiem w panelu administratora. Wysoki kontrast (jasny i ciemny) przeszedł na nowoczesną paletę kolorów wspólną ze zwykłym motywem – zamiast czerni-na-bieli tryb ten daje teraz większą czcionkę, powiększony widok i grubsze obramowania przy firmowych kolorach. Naprawiono też fałszywe ostrzeżenie o niezapisanych zmianach po rozpoczęciu nowej oferty w trakcie edycji zapisanej – pojawiało się mimo pustego, niezmienionego formularza. Blacha łezkowa otrzymała dopłatę wymiarową zależną od szerokości (30 €/t do 1,5 m, 45 €/t powyżej) oraz własną tabelę gatunków z domyślnym S235JR+N. Wersja 1.7 została wdrożona na środowisko produkcyjne 10.09.2026 wraz z migracjami 019 (zespoły seniora, tabela „team_members”) i 020 (cennik transportowy, tabele „transport_tariff_bands” i „route_cache”); wdrożenie zakończone powodzeniem.</w:t>
+              <w:t>możliwością zawężenia do siebie lub wybranego juniora. Eksport ofert, panelu „Analiza” i historii PGL do Excela otwiera się teraz z kolumnami dopasowanymi do zawartości, bez ręcznego rozciągania. Dodano automatyczne liczenie transportu z trasy dostawy: rzeczywista odległość drogowa do klienta, cennik przewoźnika w pasmach kilometrowych, przeliczanie na kursy według ładowności 21 t i dopłaty za elementy ponadwymiarowe, wraz z edytowalnym cennikiem w panelu administratora. Wysoki kontrast (jasny i ciemny) przeszedł na nowoczesną paletę kolorów wspólną ze zwykłym motywem – zamiast czerni-na-bieli tryb ten daje teraz większą czcionkę, powiększony widok i grubsze obramowania przy firmowych kolorach. Naprawiono też fałszywe ostrzeżenie o niezapisanych zmianach po rozpoczęciu nowej oferty w trakcie edycji zapisanej – pojawiało się mimo pustego, niezmienionego formularza. Blacha łezkowa otrzymała dopłatę wymiarową zależną od szerokości (30 €/t do 1,5 m, 45 €/t powyżej) oraz własną tabelę gatunków z domyślnym S235JR+N. Wersja 1.7 została wdrożona na środowisko produkcyjne 10.09.2026 wraz z migracjami 019 (zespoły seniora, tabela „team_members”) i 020 (cennik transportowy, tabele „transport_tariff_bands” i „route_cache”); wdrożenie zakończone powodzeniem.</w:t>
             </w:r>
           </w:p>
         </w:tc>
@@ -485,15 +507,15 @@
           </w:tcPr>
           <w:p>
             <w:r>
-              <w:t xml:space="preserve">Uzupełniono tabelę gatunków PICKLED (HRS Trawiona) o brakujący zakres SAPH 440 -&gt; DD12 wraz z dodatkowymi gatunkami (K367-DD14+B, FE 600 DP, S300EK, P265GH, P275SL, P355NL2, SA516G60-LOWSI, S240 D), na podstawie danych przekazanych przez klienta. Poprawiono czytelność etykiet wersjonowania na liście ofert (numer oferty offer_id/offer_id.N zamieniony miejscami z nazwą oferty jako główny nagłówek wiersza, wyraźniejsza etykieta „poprzednia wersja”). Przycisk „Aktualizuj pozycję” w kalkulatorze zmienia teraz kolor na niebieski podczas edycji istniejącej pozycji, aby odróżnić go od żółtego przycisku dodawania nowej pozycji. Kliknięcie pozycji na liście zestawienia </w:t>
+              <w:t xml:space="preserve">Uzupełniono tabelę gatunków PICKLED (HRS Trawiona) o brakujący zakres SAPH 440 -&gt; DD12 wraz z dodatkowymi gatunkami (K367-DD14+B, FE 600 DP, S300EK, P265GH, P275SL, P355NL2, SA516G60-LOWSI, S240 D), na podstawie danych przekazanych przez klienta. Poprawiono czytelność etykiet </w:t>
             </w:r>
             <w:r>
               <w:lastRenderedPageBreak/>
-              <w:t xml:space="preserve">(wiersz lub ołówek) przewija teraz widok automatycznie do góry kalkulatora. Cena bazowa PGL jest od teraz zawsze w EUR (€/t), niezależnie od waluty oferty. Podczas edycji zapisanej oferty w kalkulatorze pojawia się teraz wyraźny baner „Teraz edytujesz ofertę: offer_id”, tak by nie pomylić jej z tworzeniem nowej wyceny; baner pokazuje właściwy numer wersji (np. offer_27.1), nie surowe wewnętrzne ID wiersza w bazie. Tryb wysokiego kontrastu doczekał się osobnych wariantów jasnego i ciemnego (wcześniej był to jeden, stały motyw ignorujący przełącznik jasny/ciemny) - przełączanie między jasnym a ciemnym motywem działa teraz poprawnie również przy włączonym wysokim kontraście, a wyłączenie wysokiego kontrastu przywraca wcześniej wybrany motyw jasny lub ciemny. Poprawiono też kilka miejsc w interfejsie (pasek „Suma Huta”, przyciski przełączające, podpowiedzi gatunków, komunikaty ostrzegawcze), w których kolory tła i tekstu były zapisane na sztywno pod jasny wysoki kontrast i stawały się nieczytelne w wariancie ciemnym. Panel administratora zyskał filtrowanie i sortowanie historii zmian cen bazowych PGL (po typie stali, zakresie dat i dowolnej kolumnie tabeli) wraz z przyciskiem czyszczącym filtry; eksport do Excela odzwierciedla teraz aktualnie wybrany widok, a nie zawsze całą historię. Generowanie oferty PDF respektuje teraz język interfejsu wybrany przez handlowca (PL/EN/CS/DE) - wcześniej cały szablon PDF (nagłówki tabeli, etykiety danych klienta, uwagi prawne w stopce, podpisy) był na sztywno po polsku, niezależnie od języka ustawionego w aplikacji. Na liście „Moje oferty” naprawiono kliknięcie w rozwiniętej </w:t>
+              <w:t xml:space="preserve">wersjonowania na liście ofert (numer oferty offer_id/offer_id.N zamieniony miejscami z nazwą oferty jako główny nagłówek wiersza, wyraźniejsza etykieta „poprzednia wersja”). Przycisk „Aktualizuj pozycję” w kalkulatorze zmienia teraz kolor na niebieski podczas edycji istniejącej pozycji, aby odróżnić go od żółtego przycisku dodawania nowej pozycji. Kliknięcie pozycji na liście zestawienia (wiersz lub ołówek) przewija teraz widok automatycznie do góry kalkulatora. Cena bazowa PGL jest od teraz zawsze w EUR (€/t), niezależnie od waluty oferty. Podczas edycji zapisanej oferty w kalkulatorze pojawia się teraz wyraźny baner „Teraz edytujesz ofertę: offer_id”, tak by nie pomylić jej z tworzeniem nowej wyceny; baner pokazuje właściwy numer wersji (np. offer_27.1), nie surowe wewnętrzne ID wiersza w bazie. Tryb wysokiego kontrastu doczekał się osobnych wariantów jasnego i ciemnego (wcześniej był to jeden, stały motyw ignorujący przełącznik jasny/ciemny) - przełączanie między jasnym a ciemnym motywem działa teraz poprawnie również przy włączonym wysokim kontraście, a wyłączenie wysokiego kontrastu przywraca wcześniej wybrany motyw jasny lub ciemny. Poprawiono też kilka miejsc w interfejsie (pasek „Suma Huta”, przyciski przełączające, podpowiedzi gatunków, komunikaty ostrzegawcze), w których kolory tła i tekstu były zapisane na sztywno pod jasny wysoki kontrast i stawały się nieczytelne w wariancie ciemnym. Panel administratora zyskał filtrowanie i sortowanie historii zmian cen bazowych PGL (po typie stali, zakresie dat i dowolnej kolumnie tabeli) wraz z przyciskiem czyszczącym filtry; eksport do Excela odzwierciedla teraz </w:t>
             </w:r>
             <w:r>
               <w:lastRenderedPageBreak/>
-              <w:t>historii wersji ofert, które błędnie otwierało do edycji zawsze najnowszą wersję zamiast tej faktycznie klikniętej. W tej samej wersji dodano panel „Analiza” dla wszystkich ról (tonaż zaoferowany, wygrany i przegrany, wskaźnik skuteczności, rozbicie w czasie oraz według typu stali i klienta, tabela ofert z eksportem; zakres danych ustalany po stronie serwera - junior i senior widzą własne oferty, administrator całą firmę) wraz z nową osią „decyzja klienta” na ofercie wysłanej („wygrana” / „przegrana” / „oczekująca”, migracja 018), niezależną od statusu obiegu oferty.</w:t>
+              <w:t>aktualnie wybrany widok, a nie zawsze całą historię. Generowanie oferty PDF respektuje teraz język interfejsu wybrany przez handlowca (PL/EN/CS/DE) - wcześniej cały szablon PDF (nagłówki tabeli, etykiety danych klienta, uwagi prawne w stopce, podpisy) był na sztywno po polsku, niezależnie od języka ustawionego w aplikacji. Na liście „Moje oferty” naprawiono kliknięcie w rozwiniętej historii wersji ofert, które błędnie otwierało do edycji zawsze najnowszą wersję zamiast tej faktycznie klikniętej. W tej samej wersji dodano panel „Analiza” dla wszystkich ról (tonaż zaoferowany, wygrany i przegrany, wskaźnik skuteczności, rozbicie w czasie oraz według typu stali i klienta, tabela ofert z eksportem; zakres danych ustalany po stronie serwera - junior i senior widzą własne oferty, administrator całą firmę) wraz z nową osią „decyzja klienta” na ofercie wysłanej („wygrana” / „przegrana” / „oczekująca”, migracja 018), niezależną od statusu obiegu oferty.</w:t>
             </w:r>
           </w:p>
         </w:tc>
@@ -536,11 +558,11 @@
           </w:tcPr>
           <w:p>
             <w:r>
-              <w:t xml:space="preserve">Naprawiono brak synchronizacji kontaktu głównego wpisywanego w panelu „Klienci” z tabelą osób kontaktowych - dane osoby zapisane przy edycji firmy nie pojawiały się w zakładce „Kontakty”. Panel „Klienci” zyskał akcję „Kontakty” przy każdej firmie: rozwija listę zapisanych dla niej osób z możliwością edycji i usunięcia każdej z osobna oraz formularzem dodania kolejnej, bez przechodzenia do osobnej zakładki. Dodano migrację uzupełniającą kontakty zapisane, zanim ta poprawka weszła w życie. Dodano tryb „Wysoki kontrast” (przycisk obok Jasny/Ciemny, dostępny na wszystkich podstronach). W tym samym okresie dodano historię zmian cen bazowych PGL z eksportem do Excela, kolorowe oznaczenia typów stali HRS/CR/HDG w panelu ustawień oraz klikalne kafelki statusów na pulpicie administratora, a w kalkulatorze kliknięcie wiersza pozycji otwiera ją do edycji. Kolumna „Uwagi” w PDF oferty pokazuje teraz pełny zestaw wybranych dopłat dla każdej pozycji. Panel ustawień administratora zyskał próg „Minimalna marża (%)” - junior może odtąd wysłać ofertę do klienta bezpośrednio z szkicu, bez </w:t>
+              <w:t xml:space="preserve">Naprawiono brak synchronizacji kontaktu głównego wpisywanego w panelu „Klienci” z tabelą osób kontaktowych - dane osoby zapisane przy edycji firmy nie pojawiały się w zakładce „Kontakty”. Panel „Klienci” zyskał akcję „Kontakty” przy każdej firmie: rozwija listę zapisanych dla niej osób z możliwością edycji i usunięcia każdej z osobna oraz formularzem dodania kolejnej, bez przechodzenia do osobnej zakładki. Dodano migrację uzupełniającą kontakty zapisane, zanim ta poprawka weszła w życie. Dodano tryb „Wysoki kontrast” (przycisk obok Jasny/Ciemny, dostępny na wszystkich podstronach). W tym samym okresie dodano historię zmian cen bazowych PGL z eksportem do Excela, kolorowe oznaczenia typów </w:t>
             </w:r>
             <w:r>
               <w:lastRenderedPageBreak/>
-              <w:t>zatwierdzenia seniora/administratora, jeśli każda pozycja ma marżę i PGL bazowe w normie; w przeciwnym razie oferta nadal wymaga pełnej ścieżki zatwierdzenia. Kliknięcie w ofertę na liście (Moje oferty, Panel seniora, Panel administratora) otwiera ją teraz do edycji, tak jak pozycje w kalkulatorze. Edycja już zapisanej oferty nie nadpisuje jej w miejscu - zapisuje nową wersję („offer_30.1”, „offer_30.2”...), a poprzednie wersje zostają widoczne pod rozwijaną listą na tej samej karcie. W tym samym okresie dodano trzy nowe typy stali obok HRS/CR/HDG: PICKLED (HRS Trawiona), TEARDROP (Blacha łezkowa) i ZM (Magnelis) - wraz z własnymi tabelami gatunków, matrycami dopłat wymiarowych i (dla ZM) matrycą powłoki, w oparciu o dane przekazane przez klienta.</w:t>
+              <w:t>stali HRS/CR/HDG w panelu ustawień oraz klikalne kafelki statusów na pulpicie administratora, a w kalkulatorze kliknięcie wiersza pozycji otwiera ją do edycji. Kolumna „Uwagi” w PDF oferty pokazuje teraz pełny zestaw wybranych dopłat dla każdej pozycji. Panel ustawień administratora zyskał próg „Minimalna marża (%)” - junior może odtąd wysłać ofertę do klienta bezpośrednio z szkicu, bez zatwierdzenia seniora/administratora, jeśli każda pozycja ma marżę i PGL bazowe w normie; w przeciwnym razie oferta nadal wymaga pełnej ścieżki zatwierdzenia. Kliknięcie w ofertę na liście (Moje oferty, Panel seniora, Panel administratora) otwiera ją teraz do edycji, tak jak pozycje w kalkulatorze. Edycja już zapisanej oferty nie nadpisuje jej w miejscu - zapisuje nową wersję („offer_30.1”, „offer_30.2”...), a poprzednie wersje zostają widoczne pod rozwijaną listą na tej samej karcie. W tym samym okresie dodano trzy nowe typy stali obok HRS/CR/HDG: PICKLED (HRS Trawiona), TEARDROP (Blacha łezkowa) i ZM (Magnelis) - wraz z własnymi tabelami gatunków, matrycami dopłat wymiarowych i (dla ZM) matrycą powłoki, w oparciu o dane przekazane przez klienta.</w:t>
             </w:r>
           </w:p>
         </w:tc>
@@ -583,11 +605,11 @@
           </w:tcPr>
           <w:p>
             <w:r>
-              <w:t xml:space="preserve">Poprawki bezpieczeństwa eksportu PDF: dane oferty i klienta wpisywane przez handlowca są zabezpieczane przed wykonaniem jako kod po stronie usługi generującej dokument, a samo generowanie PDF wymaga jawnie potwierdzonej roli użytkownika. W kalkulatorze dodano ostrzeżenie przy edycji pozycji dodanych przed wersją 1.3, dla których konfiguracja dopłat nie została zapisana i nie da się jej automatycznie odtworzyć. Przebudowano panel danych klienta w kalkulatorze: dane firmy (firma, NIP, adres, SAP ID) zostały oddzielone od danych kontaktowych, a pola „Firma” i „NIP” działają jak wyszukiwarki po katalogu klientów. Osoby kontaktowe są od teraz wspólne dla całego działu - jedna firma może mieć ich wiele, a pole imienia podpowiada je od razu po kliknięciu. Naprawiono także brak natychmiastowej widoczności zmian ustawień administratora (PGL bazowe, kurs EUR/PLN) w kalkulatorze bez </w:t>
+              <w:t xml:space="preserve">Poprawki bezpieczeństwa eksportu PDF: dane oferty i klienta wpisywane przez handlowca są zabezpieczane przed wykonaniem jako kod po stronie usługi generującej dokument, a samo generowanie PDF wymaga jawnie potwierdzonej roli użytkownika. W kalkulatorze dodano ostrzeżenie przy edycji pozycji dodanych przed wersją 1.3, dla których konfiguracja dopłat nie została zapisana i nie da się jej automatycznie odtworzyć. Przebudowano panel danych klienta w kalkulatorze: dane firmy (firma, NIP, adres, SAP ID) </w:t>
             </w:r>
             <w:r>
               <w:lastRenderedPageBreak/>
-              <w:t>przeładowania strony, a PGL bazowe skonfigurowano osobno dla typów stali HRS, CR i HDG. Cena końcowa oraz sumy wartości w kalkulatorze, na liście ofert i w PDF są od teraz zaokrąglane w górę do pełnej jednostki waluty - świadoma decyzja biznesowa, żeby nigdy nie zaniżyć ceny wobec klienta.</w:t>
+              <w:t>zostały oddzielone od danych kontaktowych, a pola „Firma” i „NIP” działają jak wyszukiwarki po katalogu klientów. Osoby kontaktowe są od teraz wspólne dla całego działu - jedna firma może mieć ich wiele, a pole imienia podpowiada je od razu po kliknięciu. Naprawiono także brak natychmiastowej widoczności zmian ustawień administratora (PGL bazowe, kurs EUR/PLN) w kalkulatorze bez przeładowania strony, a PGL bazowe skonfigurowano osobno dla typów stali HRS, CR i HDG. Cena końcowa oraz sumy wartości w kalkulatorze, na liście ofert i w PDF są od teraz zaokrąglane w górę do pełnej jednostki waluty - świadoma decyzja biznesowa, żeby nigdy nie zaniżyć ceny wobec klienta.</w:t>
             </w:r>
           </w:p>
         </w:tc>
@@ -683,7 +705,11 @@
           </w:tcPr>
           <w:p>
             <w:r>
-              <w:t>Poprawki regresji po integracji podczas Deployu (m.in. krytyczny błąd edycji pozycji, przywrócona waga arkusza), ujednolicenie generowania PDF na wersję serwerową, zamknięcie rejestracji kont dla administratora oraz eksport ofert do Excela w formacie KTS/GPAO.</w:t>
+              <w:t xml:space="preserve">Poprawki regresji po integracji podczas Deployu (m.in. krytyczny błąd edycji pozycji, przywrócona waga arkusza), ujednolicenie generowania PDF na wersję serwerową, zamknięcie rejestracji kont dla administratora oraz eksport ofert do Excela w </w:t>
+            </w:r>
+            <w:r>
+              <w:lastRenderedPageBreak/>
+              <w:t>formacie KTS/GPAO.</w:t>
             </w:r>
           </w:p>
         </w:tc>
@@ -699,6 +725,7 @@
                 <w:b/>
                 <w:color w:val="1F2A44"/>
               </w:rPr>
+              <w:lastRenderedPageBreak/>
               <w:t>1.1</w:t>
             </w:r>
           </w:p>
@@ -807,7 +834,6 @@
           <w:color w:val="1F2A44"/>
           <w:sz w:val="32"/>
         </w:rPr>
-        <w:lastRenderedPageBreak/>
         <w:t>Zmiany w wersji 1.9</w:t>
       </w:r>
     </w:p>
@@ -1031,7 +1057,11 @@
           </w:tcPr>
           <w:p>
             <w:r>
-              <w:t>Naprawiono zaniżanie stawki transportu €/t na pozycjach już dodanych do zestawienia: tonaż użyty do podziału ryczałtu za ciężarówkę obejmował także ilość wpisaną w formularzu KOLEJNEJ, jeszcze niedodanej pozycji (pole „Ilość” zostaje wypełnione domyślną/poprzednią wartością nawet bez kliknięcia „Dodaj do zestawienia”), więc np. przy 1 pozycji w zestawieniu i domyślnym szkicu 1 t system dzielił stawkę tak, jakby w ofercie były 2 t - dla trasy do 100 km dawało to ok. 157 €/t zamiast poprawnych ok. 320 €/t. Wyliczenie stawki transportu rozdzielono na dwie wartości: podgląd (uwzględnia szkic niedodanej pozycji - do wyceny pozycji aktualnie konfigurowanej) i tonaż faktycznie zatwierdzony (tylko pozycje już w zestawieniu - do przeliczania stawki pozycji już dodanych). Samo wpisywanie ilości w formularzu nowej pozycji nie zmienia już po cichu ceny pozycji, które są już na liście.</w:t>
+              <w:t xml:space="preserve">Naprawiono zaniżanie stawki transportu €/t na pozycjach już dodanych do </w:t>
+            </w:r>
+            <w:r>
+              <w:lastRenderedPageBreak/>
+              <w:t>zestawienia: tonaż użyty do podziału ryczałtu za ciężarówkę obejmował także ilość wpisaną w formularzu KOLEJNEJ, jeszcze niedodanej pozycji (pole „Ilość” zostaje wypełnione domyślną/poprzednią wartością nawet bez kliknięcia „Dodaj do zestawienia”), więc np. przy 1 pozycji w zestawieniu i domyślnym szkicu 1 t system dzielił stawkę tak, jakby w ofercie były 2 t - dla trasy do 100 km dawało to ok. 157 €/t zamiast poprawnych ok. 320 €/t. Wyliczenie stawki transportu rozdzielono na dwie wartości: podgląd (uwzględnia szkic niedodanej pozycji - do wyceny pozycji aktualnie konfigurowanej) i tonaż faktycznie zatwierdzony (tylko pozycje już w zestawieniu - do przeliczania stawki pozycji już dodanych). Samo wpisywanie ilości w formularzu nowej pozycji nie zmienia już po cichu ceny pozycji, które są już na liście.</w:t>
             </w:r>
           </w:p>
         </w:tc>
@@ -1043,6 +1073,7 @@
           </w:tcPr>
           <w:p>
             <w:r>
+              <w:lastRenderedPageBreak/>
               <w:t>Zmiana</w:t>
             </w:r>
           </w:p>
@@ -1053,11 +1084,7 @@
           </w:tcPr>
           <w:p>
             <w:r>
-              <w:t xml:space="preserve">Przyciski Q1–Q4 w okresie ważności oferty (Ważna od/Ważna do) pokazują teraz tylko kwartały wybranego roku, które jeszcze się nie zakończyły – dla roku bieżącego znikają więc już minione kwartały (np. we wrześniu 2026 widoczne są tylko Q3 i Q4), tak by handlowiec nie mógł przez pomyłkę wystawić nowej oferty z okresem ważności całkowicie w przeszłości; trwający kwartał liczy się jako wciąż dostępny. Przy zmianie roku na kolejny (np. z 2026 na 2027) nowo odslonięte kwartały (Q1, Q2) pojawiają się z krótką animacją wsunięcia zamiast skokowo, a przy </w:t>
-            </w:r>
-            <w:r>
-              <w:lastRenderedPageBreak/>
-              <w:t>powrocie na rok, w którym już minęły, znikają z analogiczną animacją zamiast po prostu znikać.</w:t>
+              <w:t>Przyciski Q1–Q4 w okresie ważności oferty (Ważna od/Ważna do) pokazują teraz tylko kwartały wybranego roku, które jeszcze się nie zakończyły – dla roku bieżącego znikają więc już minione kwartały (np. we wrześniu 2026 widoczne są tylko Q3 i Q4), tak by handlowiec nie mógł przez pomyłkę wystawić nowej oferty z okresem ważności całkowicie w przeszłości; trwający kwartał liczy się jako wciąż dostępny. Przy zmianie roku na kolejny (np. z 2026 na 2027) nowo odslonięte kwartały (Q1, Q2) pojawiają się z krótką animacją wsunięcia zamiast skokowo, a przy powrocie na rok, w którym już minęły, znikają z analogiczną animacją zamiast po prostu znikać.</w:t>
             </w:r>
           </w:p>
         </w:tc>
@@ -1069,7 +1096,6 @@
           </w:tcPr>
           <w:p>
             <w:r>
-              <w:lastRenderedPageBreak/>
               <w:t>Zmiana</w:t>
             </w:r>
           </w:p>
@@ -1140,6 +1166,7 @@
           <w:color w:val="2B57A6"/>
           <w:sz w:val="26"/>
         </w:rPr>
+        <w:lastRenderedPageBreak/>
         <w:t>Zarządzanie ofertami</w:t>
       </w:r>
     </w:p>
@@ -1237,11 +1264,7 @@
           </w:tcPr>
           <w:p>
             <w:r>
-              <w:t xml:space="preserve">Wyszukiwarka na liście „Moje oferty” (oraz w panelach Starszego handlowca i Administratora) rozszerzona o dopasowanie po nazwie firmy klienta i numerze SAP ID, nie tylko po nazwie/numerze oferty jak dotychczas - dane porównywane są z zapisanym w samej ofercie offer_data.clientInfo, więc wynik zawsze widocznie zawiera wpisaną frazę. Opcja sortowania „Nazwa” na liście „Moje oferty” zmieniona na „Nazwa oferty”, żeby nie myliła się z nazwą firmy klienta, a obok niej doszły nowe opcje sortowania „Firma” i „SAP ID”. Panele Starszego handlowca i Administratora, które wcześniej nie miały żadnego sortowania, dostały ten sam pełny zestaw (data, nazwa oferty, firma, SAP ID, wartość, status) - dla Starszego handlowca domyślna kolejność z kolejką ofert do recenzji zawsze na górze została zachowana niezależnie od wybranego kierunku </w:t>
-            </w:r>
-            <w:r>
-              <w:lastRenderedPageBreak/>
-              <w:t>sortowania. Zmiana obejmuje wszystkie 4 języki interfejsu aplikacji (PL/EN/CS/DE).</w:t>
+              <w:t>Wyszukiwarka na liście „Moje oferty” (oraz w panelach Starszego handlowca i Administratora) rozszerzona o dopasowanie po nazwie firmy klienta i numerze SAP ID, nie tylko po nazwie/numerze oferty jak dotychczas - dane porównywane są z zapisanym w samej ofercie offer_data.clientInfo, więc wynik zawsze widocznie zawiera wpisaną frazę. Opcja sortowania „Nazwa” na liście „Moje oferty” zmieniona na „Nazwa oferty”, żeby nie myliła się z nazwą firmy klienta, a obok niej doszły nowe opcje sortowania „Firma” i „SAP ID”. Panele Starszego handlowca i Administratora, które wcześniej nie miały żadnego sortowania, dostały ten sam pełny zestaw (data, nazwa oferty, firma, SAP ID, wartość, status) - dla Starszego handlowca domyślna kolejność z kolejką ofert do recenzji zawsze na górze została zachowana niezależnie od wybranego kierunku sortowania. Zmiana obejmuje wszystkie 4 języki interfejsu aplikacji (PL/EN/CS/DE).</w:t>
             </w:r>
           </w:p>
         </w:tc>
@@ -1253,7 +1276,6 @@
           </w:tcPr>
           <w:p>
             <w:r>
-              <w:lastRenderedPageBreak/>
               <w:t>Zmiana</w:t>
             </w:r>
           </w:p>
@@ -1355,7 +1377,11 @@
           </w:tcPr>
           <w:p>
             <w:r>
-              <w:t>Termin płatności w kalkulatorze oraz w panelu klientów (zakładka „Klienci” u administratora i w panelu Starszego handlowca) zamieniony z pary pól dat „od”/„do” na gotowe przyciski liczby dni: 0 (opisane jako „Przedpłata”), 15, 30, 45, 60, 90, oraz przycisk „Inny” odsłaniający pole do wpisania dowolnej wartości (0–365 dni, ten sam limit co dotychczasowe ograniczenie w bazie danych). Wybrany termin trafia do stopki PDF jako „Termin płatności: N dni.” (albo „Warunki płatności: przedpłata.” dla wartości 0) zamiast dotychczasowego zakresu dwóch dat; brak wyboru pozostawia ogólną formułkę „wg ustaleń indywidualnych”, tak jak dotychczas. Usunięto też ze stopki PDF stałą, niezmienną formułkę „Ważność oferty: 48h od daty wystawienia” — opcjonalna linia z rzeczywiście wybranym przez handlowca okresem ważności oferty (Ważna od/Ważna do) pozostaje bez zmian. Zmiana obejmuje wszystkie 4 języki interfejsu (PL/EN/CS/DE).</w:t>
+              <w:t xml:space="preserve">Termin płatności w kalkulatorze oraz w panelu klientów (zakładka „Klienci” u administratora i w panelu Starszego handlowca) zamieniony z pary pól dat „od”/„do” na gotowe przyciski liczby dni: 0 (opisane jako „Przedpłata”), 15, 30, 45, 60, 90, oraz przycisk „Inny” odsłaniający pole do wpisania dowolnej wartości (0–365 dni, ten sam limit co dotychczasowe ograniczenie w bazie danych). Wybrany termin trafia do stopki PDF jako „Termin płatności: N dni.” (albo „Warunki płatności: przedpłata.” dla </w:t>
+            </w:r>
+            <w:r>
+              <w:lastRenderedPageBreak/>
+              <w:t>wartości 0) zamiast dotychczasowego zakresu dwóch dat; brak wyboru pozostawia ogólną formułkę „wg ustaleń indywidualnych”, tak jak dotychczas. Usunięto też ze stopki PDF stałą, niezmienną formułkę „Ważność oferty: 48h od daty wystawienia” — opcjonalna linia z rzeczywiście wybranym przez handlowca okresem ważności oferty (Ważna od/Ważna do) pozostaje bez zmian. Zmiana obejmuje wszystkie 4 języki interfejsu (PL/EN/CS/DE).</w:t>
             </w:r>
           </w:p>
         </w:tc>
@@ -1367,6 +1393,7 @@
           </w:tcPr>
           <w:p>
             <w:r>
+              <w:lastRenderedPageBreak/>
               <w:t>Poprawka</w:t>
             </w:r>
           </w:p>
@@ -1399,11 +1426,7 @@
           </w:tcPr>
           <w:p>
             <w:r>
-              <w:t xml:space="preserve">Okres ważności oferty („Ważna od”/„Ważna do” w kalkulatorze) zyskał te same gotowe przyciski co termin płatności: Q1–Q4 wybranego roku, „Ten miesiąc” (od dzisiaj do końca miesiąca) oraz „Niestandardowy” odsłaniający surowe pola dat — zamiast wpisywania obu dat ręcznie za każdym razem. Wybór kwartału/miesiąca automatycznie dobiera odpowiednie PGL bazowe, dokładnie tak jak dotychczas robiły to ręcznie wpisane daty. Nowa oferta bez wybranego klienta dostaje teraz domyślnie </w:t>
-            </w:r>
-            <w:r>
-              <w:lastRenderedPageBreak/>
-              <w:t>okres „Ten miesiąc” oraz 2-dniowy termin płatności (zamiast pustych pól) — handlowiec może to nadpisać w każdej chwili. Przywrócono też do stopki PDF dawną linijkę „Ważność oferty: 48h od daty wystawienia”, usuniętą przy wprowadzeniu przycisków terminu płatności — tym razem liczoną dynamicznie z wybranego terminu płatności (dni × 24h) zamiast być na sztywno wpisaną liczbą godzin; przy przedpłacie (0 dni) linijka się nie pojawia, bo godziny nie mają wtedy sensu.</w:t>
+              <w:t>Okres ważności oferty („Ważna od”/„Ważna do” w kalkulatorze) zyskał te same gotowe przyciski co termin płatności: Q1–Q4 wybranego roku, „Ten miesiąc” (od dzisiaj do końca miesiąca) oraz „Niestandardowy” odsłaniający surowe pola dat — zamiast wpisywania obu dat ręcznie za każdym razem. Wybór kwartału/miesiąca automatycznie dobiera odpowiednie PGL bazowe, dokładnie tak jak dotychczas robiły to ręcznie wpisane daty. Nowa oferta bez wybranego klienta dostaje teraz domyślnie okres „Ten miesiąc” oraz 2-dniowy termin płatności (zamiast pustych pól) — handlowiec może to nadpisać w każdej chwili. Przywrócono też do stopki PDF dawną linijkę „Ważność oferty: 48h od daty wystawienia”, usuniętą przy wprowadzeniu przycisków terminu płatności — tym razem liczoną dynamicznie z wybranego terminu płatności (dni × 24h) zamiast być na sztywno wpisaną liczbą godzin; przy przedpłacie (0 dni) linijka się nie pojawia, bo godziny nie mają wtedy sensu.</w:t>
             </w:r>
           </w:p>
         </w:tc>
@@ -1415,7 +1438,6 @@
           </w:tcPr>
           <w:p>
             <w:r>
-              <w:lastRenderedPageBreak/>
               <w:t>Poprawka</w:t>
             </w:r>
           </w:p>
@@ -1517,7 +1539,11 @@
           </w:tcPr>
           <w:p>
             <w:r>
-              <w:t>Poprawiono responsywność całej aplikacji w pionowej orientacji telefonu (ok. 375 px szerokości) - dotychczas stałe wielokolumnowe siatki (np. grid-cols-3/4) i sztywne szerokości w pikselach nie miały progów responsywnych, więc na wąskim ekranie kolumny się zgniatały, tekst się urywał, a niektóre wiersze wychodziły poza szerokość ekranu. Poprawiono kolejno: wspólny nagłówek i górną nawigację (zawijanie na dwa wiersze, ikony bez podpisów poniżej progu telefonu) we wszystkich pięciu miejscach, w których nagłówek był powielony; górny pasek parametrów kalkulatora (grubość/szerokość/długość/gatunek, dane klienta i kontaktu) oraz panel dopłat i podsumowania finansowego (rozbicie na jedną kolumnę zamiast zgniecionych 2-3 kolumn); tabelę Zestawienia (zwężone marginesy kolumn, cień przewijania sygnalizujący dodatkową zawartość w poziomie); listę „Moje oferty” (poprawiono nakładające się i ucinane przyciski akcji Excel/PDF/Usuń oraz dodano rozwijanie pełnej nazwy firmy i numeru SAP stuknięciem, bez trwałej zmiany wysokości wiersza); panele administratora (m.in. zgnieciony do dwóch kolumn na telefonie panel wyników „Wyniki” handlowca w zakładce „Handlowcy”, mimo dostępnej szerokości jednej kolumny); oraz panel Analiza i panel Starszego handlowca (zawijanie pięciu zakładek filtrowania kolejki ofert, które wcześniej ucinały ostatnią zakładkę „Klienci” poza ekranem, oraz te same nakładające się przyciski akcji na liście ofert do weryfikacji co w „Moje oferty”). Zmiana dotyczy wyłącznie wąskiego widoku telefonu - wygląd na komputerze i w poziomej orientacji telefonu pozostaje identyczny jak wcześniej.</w:t>
+              <w:t xml:space="preserve">Poprawiono responsywność całej aplikacji w pionowej orientacji telefonu (ok. 375 px szerokości) - dotychczas stałe wielokolumnowe siatki (np. grid-cols-3/4) i sztywne szerokości w pikselach nie miały progów responsywnych, więc na wąskim ekranie kolumny się zgniatały, tekst się </w:t>
+            </w:r>
+            <w:r>
+              <w:lastRenderedPageBreak/>
+              <w:t>urywał, a niektóre wiersze wychodziły poza szerokość ekranu. Poprawiono kolejno: wspólny nagłówek i górną nawigację (zawijanie na dwa wiersze, ikony bez podpisów poniżej progu telefonu) we wszystkich pięciu miejscach, w których nagłówek był powielony; górny pasek parametrów kalkulatora (grubość/szerokość/długość/gatunek, dane klienta i kontaktu) oraz panel dopłat i podsumowania finansowego (rozbicie na jedną kolumnę zamiast zgniecionych 2-3 kolumn); tabelę Zestawienia (zwężone marginesy kolumn, cień przewijania sygnalizujący dodatkową zawartość w poziomie); listę „Moje oferty” (poprawiono nakładające się i ucinane przyciski akcji Excel/PDF/Usuń oraz dodano rozwijanie pełnej nazwy firmy i numeru SAP stuknięciem, bez trwałej zmiany wysokości wiersza); panele administratora (m.in. zgnieciony do dwóch kolumn na telefonie panel wyników „Wyniki” handlowca w zakładce „Handlowcy”, mimo dostępnej szerokości jednej kolumny); oraz panel Analiza i panel Starszego handlowca (zawijanie pięciu zakładek filtrowania kolejki ofert, które wcześniej ucinały ostatnią zakładkę „Klienci” poza ekranem, oraz te same nakładające się przyciski akcji na liście ofert do weryfikacji co w „Moje oferty”). Zmiana dotyczy wyłącznie wąskiego widoku telefonu - wygląd na komputerze i w poziomej orientacji telefonu pozostaje identyczny jak wcześniej.</w:t>
             </w:r>
           </w:p>
         </w:tc>
@@ -1529,6 +1555,7 @@
           </w:tcPr>
           <w:p>
             <w:r>
+              <w:lastRenderedPageBreak/>
               <w:t>Nowa funkcja</w:t>
             </w:r>
           </w:p>
@@ -1539,11 +1566,7 @@
           </w:tcPr>
           <w:p>
             <w:r>
-              <w:t xml:space="preserve">Panel „Analiza” pokazuje teraz przy każdym zawężeniu do jednej wartości (handlowiec, typ stali, status oferty, decyzja klienta lub firma klienta) osobną, zamykalną plakietkę z wybraną wartością – zarówno w zbiorczym pasku na górze strony (widoczny cały zestaw aktywnych filtrów naraz), jak i bezpośrednio przy panelu, z którego zawężenie zostało wybrane, oraz </w:t>
-            </w:r>
-            <w:r>
-              <w:lastRenderedPageBreak/>
-              <w:t>przy przycisku eksportu do Excela. Wcześniej jedynym miejscem do wyczyszczenia takiego filtra był pasek filtrów na samej górze strony.</w:t>
+              <w:t>Panel „Analiza” pokazuje teraz przy każdym zawężeniu do jednej wartości (handlowiec, typ stali, status oferty, decyzja klienta lub firma klienta) osobną, zamykalną plakietkę z wybraną wartością – zarówno w zbiorczym pasku na górze strony (widoczny cały zestaw aktywnych filtrów naraz), jak i bezpośrednio przy panelu, z którego zawężenie zostało wybrane, oraz przy przycisku eksportu do Excela. Wcześniej jedynym miejscem do wyczyszczenia takiego filtra był pasek filtrów na samej górze strony.</w:t>
             </w:r>
           </w:p>
         </w:tc>
@@ -1555,7 +1578,6 @@
           </w:tcPr>
           <w:p>
             <w:r>
-              <w:lastRenderedPageBreak/>
               <w:t>Nowa funkcja</w:t>
             </w:r>
           </w:p>
@@ -1620,6 +1642,7 @@
         <w:pStyle w:val="Listapunktowana"/>
       </w:pPr>
       <w:r>
+        <w:lastRenderedPageBreak/>
         <w:t>Hasła kont testowych o długości 4 znaków (celowo obniżone na czas testów) - docelowo wymaga blokady prób logowania zamiast podnoszenia wymogu długości</w:t>
       </w:r>
     </w:p>
@@ -1657,7 +1680,13 @@
         <w:pStyle w:val="Listapunktowana"/>
       </w:pPr>
       <w:r>
-        <w:t>Testy ręczne end-to-end wszystkich trzech ról i pełnego obiegu oferty na środowisku produkcyjnym (po wdrożeniu wersji 1.8)</w:t>
+        <w:t>Testy ręczne end-to-end wszystkich trzech ról i pełnego obiegu oferty na środowisku produkcyjnym (po wdrożeniu wersji 1.</w:t>
+      </w:r>
+      <w:r>
+        <w:t>9</w:t>
+      </w:r>
+      <w:r>
+        <w:t>)</w:t>
       </w:r>
     </w:p>
     <w:p>

</xml_diff>